<commit_message>
docs(solution): replace ASCII diagrams with clean PNGs exported from the deck
</commit_message>
<xml_diff>
--- a/docs/solution/Landshield-Solution-Document.docx
+++ b/docs/solution/Landshield-Solution-Document.docx
@@ -63,7 +63,7 @@
           <w:sz w:val="22"/>
           <w:szCs w:val="22"/>
         </w:rPr>
-        <w:pict w14:anchorId="7019BFCF">
+        <w:pict w14:anchorId="19DE8E3F">
           <v:rect id="_x0000_i1025" style="width:0;height:1.5pt" o:hralign="center" o:hrstd="t" o:hr="t" fillcolor="#a0a0a0" stroked="f"/>
         </w:pict>
       </w:r>
@@ -356,7 +356,7 @@
           <w:sz w:val="22"/>
           <w:szCs w:val="22"/>
         </w:rPr>
-        <w:pict w14:anchorId="26E0487C">
+        <w:pict w14:anchorId="0A03B6D8">
           <v:rect id="_x0000_i1026" style="width:0;height:1.5pt" o:hralign="center" o:hrstd="t" o:hr="t" fillcolor="#a0a0a0" stroked="f"/>
         </w:pict>
       </w:r>
@@ -678,7 +678,7 @@
           <w:sz w:val="22"/>
           <w:szCs w:val="22"/>
         </w:rPr>
-        <w:pict w14:anchorId="05498043">
+        <w:pict w14:anchorId="4B8A3989">
           <v:rect id="_x0000_i1027" style="width:0;height:1.5pt" o:hralign="center" o:hrstd="t" o:hr="t" fillcolor="#a0a0a0" stroked="f"/>
         </w:pict>
       </w:r>
@@ -1295,7 +1295,7 @@
           <w:sz w:val="22"/>
           <w:szCs w:val="22"/>
         </w:rPr>
-        <w:pict w14:anchorId="6FCA3B31">
+        <w:pict w14:anchorId="10CE1809">
           <v:rect id="_x0000_i1028" style="width:0;height:1.5pt" o:hralign="center" o:hrstd="t" o:hr="t" fillcolor="#a0a0a0" stroked="f"/>
         </w:pict>
       </w:r>
@@ -1332,6 +1332,7 @@
           <w:sz w:val="22"/>
           <w:szCs w:val="22"/>
         </w:rPr>
+        <w:lastRenderedPageBreak/>
         <w:t>Number of agents: 5</w:t>
       </w:r>
       <w:r>
@@ -1360,1131 +1361,70 @@
     </w:p>
     <w:p>
       <w:pPr>
-        <w:pStyle w:val="HTMLPreformatted"/>
-        <w:rPr>
-          <w:rStyle w:val="HTMLCode"/>
-          <w:color w:val="202124"/>
-        </w:rPr>
-      </w:pPr>
-      <w:r>
-        <w:rPr>
-          <w:rStyle w:val="HTMLCode"/>
-          <w:color w:val="202124"/>
-        </w:rPr>
-        <w:t xml:space="preserve">            ┌─────────────────────────────────────────────────────────┐</w:t>
-      </w:r>
-    </w:p>
-    <w:p>
-      <w:pPr>
-        <w:pStyle w:val="HTMLPreformatted"/>
-        <w:rPr>
-          <w:rStyle w:val="HTMLCode"/>
-          <w:color w:val="202124"/>
-        </w:rPr>
-      </w:pPr>
-      <w:r>
-        <w:rPr>
-          <w:rStyle w:val="HTMLCode"/>
-          <w:color w:val="202124"/>
-        </w:rPr>
-        <w:t xml:space="preserve">            │   1.  Orchestrator Agent  (FastAPI / Cloud Run)         │</w:t>
-      </w:r>
-    </w:p>
-    <w:p>
-      <w:pPr>
-        <w:pStyle w:val="HTMLPreformatted"/>
-        <w:rPr>
-          <w:rStyle w:val="HTMLCode"/>
-          <w:color w:val="202124"/>
-        </w:rPr>
-      </w:pPr>
-      <w:r>
-        <w:rPr>
-          <w:rStyle w:val="HTMLCode"/>
-          <w:color w:val="202124"/>
-        </w:rPr>
-        <w:t xml:space="preserve">            │       - receives bundle, validates, fans out work       │</w:t>
-      </w:r>
-    </w:p>
-    <w:p>
-      <w:pPr>
-        <w:pStyle w:val="HTMLPreformatted"/>
-        <w:rPr>
-          <w:rStyle w:val="HTMLCode"/>
-          <w:color w:val="202124"/>
-        </w:rPr>
-      </w:pPr>
-      <w:r>
-        <w:rPr>
-          <w:rStyle w:val="HTMLCode"/>
-          <w:color w:val="202124"/>
-        </w:rPr>
-        <w:t xml:space="preserve">            </w:t>
-      </w:r>
-      <w:r>
-        <w:rPr>
-          <w:rStyle w:val="HTMLCode"/>
-          <w:color w:val="202124"/>
-        </w:rPr>
-        <w:t>│</w:t>
-      </w:r>
-      <w:r>
-        <w:rPr>
-          <w:rStyle w:val="HTMLCode"/>
-          <w:color w:val="202124"/>
-        </w:rPr>
-        <w:t xml:space="preserve">       - streams progress (SSE), persists state          </w:t>
-      </w:r>
-      <w:r>
-        <w:rPr>
-          <w:rStyle w:val="HTMLCode"/>
-          <w:color w:val="202124"/>
-        </w:rPr>
-        <w:t>│</w:t>
-      </w:r>
-    </w:p>
-    <w:p>
-      <w:pPr>
-        <w:pStyle w:val="HTMLPreformatted"/>
-        <w:rPr>
-          <w:rStyle w:val="HTMLCode"/>
-          <w:color w:val="202124"/>
-        </w:rPr>
-      </w:pPr>
-      <w:r>
-        <w:rPr>
-          <w:rStyle w:val="HTMLCode"/>
-          <w:color w:val="202124"/>
-        </w:rPr>
-        <w:t xml:space="preserve">            </w:t>
-      </w:r>
-      <w:r>
-        <w:rPr>
-          <w:rStyle w:val="HTMLCode"/>
-          <w:color w:val="202124"/>
-        </w:rPr>
-        <w:t>└────────┬────────────────────────────────────────────────┘</w:t>
-      </w:r>
-    </w:p>
-    <w:p>
-      <w:pPr>
-        <w:pStyle w:val="HTMLPreformatted"/>
-        <w:rPr>
-          <w:rStyle w:val="HTMLCode"/>
-          <w:color w:val="202124"/>
-        </w:rPr>
-      </w:pPr>
-      <w:r>
-        <w:rPr>
-          <w:rStyle w:val="HTMLCode"/>
-          <w:color w:val="202124"/>
-        </w:rPr>
-        <w:t xml:space="preserve">                     </w:t>
-      </w:r>
-      <w:r>
-        <w:rPr>
-          <w:rStyle w:val="HTMLCode"/>
-          <w:color w:val="202124"/>
-        </w:rPr>
-        <w:t>│ ① extract structured data</w:t>
-      </w:r>
-    </w:p>
-    <w:p>
-      <w:pPr>
-        <w:pStyle w:val="HTMLPreformatted"/>
-        <w:rPr>
-          <w:rStyle w:val="HTMLCode"/>
-          <w:color w:val="202124"/>
-        </w:rPr>
-      </w:pPr>
-      <w:r>
-        <w:rPr>
-          <w:rStyle w:val="HTMLCode"/>
-          <w:color w:val="202124"/>
-        </w:rPr>
-        <w:t xml:space="preserve">                     </w:t>
-      </w:r>
-      <w:r>
-        <w:rPr>
-          <w:rStyle w:val="HTMLCode"/>
-          <w:color w:val="202124"/>
-        </w:rPr>
-        <w:t>▼</w:t>
-      </w:r>
-    </w:p>
-    <w:p>
-      <w:pPr>
-        <w:pStyle w:val="HTMLPreformatted"/>
-        <w:rPr>
-          <w:rStyle w:val="HTMLCode"/>
-          <w:color w:val="202124"/>
-        </w:rPr>
-      </w:pPr>
-      <w:r>
-        <w:rPr>
-          <w:rStyle w:val="HTMLCode"/>
-          <w:color w:val="202124"/>
-        </w:rPr>
-        <w:t xml:space="preserve">            </w:t>
-      </w:r>
-      <w:r>
-        <w:rPr>
-          <w:rStyle w:val="HTMLCode"/>
-          <w:color w:val="202124"/>
-        </w:rPr>
-        <w:t>┌─────────────────────────────────────────────────────────┐</w:t>
-      </w:r>
-    </w:p>
-    <w:p>
-      <w:pPr>
-        <w:pStyle w:val="HTMLPreformatted"/>
-        <w:rPr>
-          <w:rStyle w:val="HTMLCode"/>
-          <w:color w:val="202124"/>
-        </w:rPr>
-      </w:pPr>
-      <w:r>
-        <w:rPr>
-          <w:rStyle w:val="HTMLCode"/>
-          <w:color w:val="202124"/>
-        </w:rPr>
-        <w:t xml:space="preserve">            </w:t>
-      </w:r>
-      <w:r>
-        <w:rPr>
-          <w:rStyle w:val="HTMLCode"/>
-          <w:color w:val="202124"/>
-        </w:rPr>
-        <w:t>│</w:t>
-      </w:r>
-      <w:r>
-        <w:rPr>
-          <w:rStyle w:val="HTMLCode"/>
-          <w:color w:val="202124"/>
-        </w:rPr>
-        <w:t xml:space="preserve">   2.  Parser Agent  (Gemini 2.5-flash, multimodal)      </w:t>
-      </w:r>
-      <w:r>
-        <w:rPr>
-          <w:rStyle w:val="HTMLCode"/>
-          <w:color w:val="202124"/>
-        </w:rPr>
-        <w:t>│</w:t>
-      </w:r>
-    </w:p>
-    <w:p>
-      <w:pPr>
-        <w:pStyle w:val="HTMLPreformatted"/>
-        <w:rPr>
-          <w:rStyle w:val="HTMLCode"/>
-          <w:color w:val="202124"/>
-        </w:rPr>
-      </w:pPr>
-      <w:r>
-        <w:rPr>
-          <w:rStyle w:val="HTMLCode"/>
-          <w:color w:val="202124"/>
-        </w:rPr>
-        <w:t xml:space="preserve">            │       - reads PDFs natively                             │</w:t>
-      </w:r>
-    </w:p>
-    <w:p>
-      <w:pPr>
-        <w:pStyle w:val="HTMLPreformatted"/>
-        <w:rPr>
-          <w:rStyle w:val="HTMLCode"/>
-          <w:color w:val="202124"/>
-        </w:rPr>
-      </w:pPr>
-      <w:r>
-        <w:rPr>
-          <w:rStyle w:val="HTMLCode"/>
-          <w:color w:val="202124"/>
-        </w:rPr>
-        <w:t xml:space="preserve">            │       - returns strict JSON: parties, property,         │</w:t>
-      </w:r>
-    </w:p>
-    <w:p>
-      <w:pPr>
-        <w:pStyle w:val="HTMLPreformatted"/>
-        <w:rPr>
-          <w:rStyle w:val="HTMLCode"/>
-          <w:color w:val="202124"/>
-        </w:rPr>
-      </w:pPr>
-      <w:r>
-        <w:rPr>
-          <w:rStyle w:val="HTMLCode"/>
-          <w:color w:val="202124"/>
-        </w:rPr>
-        <w:t xml:space="preserve">            </w:t>
-      </w:r>
-      <w:r>
-        <w:rPr>
-          <w:rStyle w:val="HTMLCode"/>
-          <w:color w:val="202124"/>
-        </w:rPr>
-        <w:t>│</w:t>
-      </w:r>
-      <w:r>
-        <w:rPr>
-          <w:rStyle w:val="HTMLCode"/>
-          <w:color w:val="202124"/>
-        </w:rPr>
-        <w:t xml:space="preserve">         registration, stamp duty, chain of title        </w:t>
-      </w:r>
-      <w:r>
-        <w:rPr>
-          <w:rStyle w:val="HTMLCode"/>
-          <w:color w:val="202124"/>
-        </w:rPr>
-        <w:t>│</w:t>
-      </w:r>
-    </w:p>
-    <w:p>
-      <w:pPr>
-        <w:pStyle w:val="HTMLPreformatted"/>
-        <w:rPr>
-          <w:rStyle w:val="HTMLCode"/>
-          <w:color w:val="202124"/>
-        </w:rPr>
-      </w:pPr>
-      <w:r>
-        <w:rPr>
-          <w:rStyle w:val="HTMLCode"/>
-          <w:color w:val="202124"/>
-        </w:rPr>
-        <w:t xml:space="preserve">            └────────┬────────────────────────────────────────────────┘</w:t>
-      </w:r>
-    </w:p>
-    <w:p>
-      <w:pPr>
-        <w:pStyle w:val="HTMLPreformatted"/>
-        <w:rPr>
-          <w:rStyle w:val="HTMLCode"/>
-          <w:color w:val="202124"/>
-        </w:rPr>
-      </w:pPr>
-      <w:r>
-        <w:rPr>
-          <w:rStyle w:val="HTMLCode"/>
-          <w:color w:val="202124"/>
-        </w:rPr>
-        <w:t xml:space="preserve">                     │ ② run rules + fraud in parallel</w:t>
-      </w:r>
-    </w:p>
-    <w:p>
-      <w:pPr>
-        <w:pStyle w:val="HTMLPreformatted"/>
-        <w:rPr>
-          <w:rStyle w:val="HTMLCode"/>
-          <w:color w:val="202124"/>
-        </w:rPr>
-      </w:pPr>
-      <w:r>
-        <w:rPr>
-          <w:rStyle w:val="HTMLCode"/>
-          <w:color w:val="202124"/>
-        </w:rPr>
-        <w:t xml:space="preserve">                     </w:t>
-      </w:r>
-      <w:r>
-        <w:rPr>
-          <w:rStyle w:val="HTMLCode"/>
-          <w:color w:val="202124"/>
-        </w:rPr>
-        <w:t>├──────────────────────┐</w:t>
-      </w:r>
-    </w:p>
-    <w:p>
-      <w:pPr>
-        <w:pStyle w:val="HTMLPreformatted"/>
-        <w:rPr>
-          <w:rStyle w:val="HTMLCode"/>
-          <w:color w:val="202124"/>
-        </w:rPr>
-      </w:pPr>
-      <w:r>
-        <w:rPr>
-          <w:rStyle w:val="HTMLCode"/>
-          <w:color w:val="202124"/>
-        </w:rPr>
-        <w:t xml:space="preserve">                     </w:t>
-      </w:r>
-      <w:r>
-        <w:rPr>
-          <w:rStyle w:val="HTMLCode"/>
-          <w:color w:val="202124"/>
-        </w:rPr>
-        <w:t>▼</w:t>
-      </w:r>
-      <w:r>
-        <w:rPr>
-          <w:rStyle w:val="HTMLCode"/>
-          <w:color w:val="202124"/>
-        </w:rPr>
-        <w:t xml:space="preserve">                      </w:t>
-      </w:r>
-      <w:r>
-        <w:rPr>
-          <w:rStyle w:val="HTMLCode"/>
-          <w:color w:val="202124"/>
-        </w:rPr>
-        <w:t>▼</w:t>
-      </w:r>
-    </w:p>
-    <w:p>
-      <w:pPr>
-        <w:pStyle w:val="HTMLPreformatted"/>
-        <w:rPr>
-          <w:rStyle w:val="HTMLCode"/>
-          <w:color w:val="202124"/>
-        </w:rPr>
-      </w:pPr>
-      <w:r>
-        <w:rPr>
-          <w:rStyle w:val="HTMLCode"/>
-          <w:color w:val="202124"/>
-        </w:rPr>
-        <w:t xml:space="preserve">       </w:t>
-      </w:r>
-      <w:r>
-        <w:rPr>
-          <w:rStyle w:val="HTMLCode"/>
-          <w:color w:val="202124"/>
-        </w:rPr>
-        <w:t>┌──────────────────────┐</w:t>
-      </w:r>
-      <w:r>
-        <w:rPr>
-          <w:rStyle w:val="HTMLCode"/>
-          <w:color w:val="202124"/>
-        </w:rPr>
-        <w:t xml:space="preserve">   </w:t>
-      </w:r>
-      <w:r>
-        <w:rPr>
-          <w:rStyle w:val="HTMLCode"/>
-          <w:color w:val="202124"/>
-        </w:rPr>
-        <w:t>┌──────────────────────┐</w:t>
-      </w:r>
-    </w:p>
-    <w:p>
-      <w:pPr>
-        <w:pStyle w:val="HTMLPreformatted"/>
-        <w:rPr>
-          <w:rStyle w:val="HTMLCode"/>
-          <w:color w:val="202124"/>
-        </w:rPr>
-      </w:pPr>
-      <w:r>
-        <w:rPr>
-          <w:rStyle w:val="HTMLCode"/>
-          <w:color w:val="202124"/>
-        </w:rPr>
-        <w:t xml:space="preserve">       </w:t>
-      </w:r>
-      <w:r>
-        <w:rPr>
-          <w:rStyle w:val="HTMLCode"/>
-          <w:color w:val="202124"/>
-        </w:rPr>
-        <w:t>│ 3. Legal Rules Agent │</w:t>
-      </w:r>
-      <w:r>
-        <w:rPr>
-          <w:rStyle w:val="HTMLCode"/>
-          <w:color w:val="202124"/>
-        </w:rPr>
-        <w:t xml:space="preserve">   </w:t>
-      </w:r>
-      <w:r>
-        <w:rPr>
-          <w:rStyle w:val="HTMLCode"/>
-          <w:color w:val="202124"/>
-        </w:rPr>
-        <w:t>│ 4. Fraud Detection</w:t>
-      </w:r>
-      <w:r>
-        <w:rPr>
-          <w:rStyle w:val="HTMLCode"/>
-          <w:color w:val="202124"/>
-        </w:rPr>
-        <w:t xml:space="preserve">   </w:t>
-      </w:r>
-      <w:r>
-        <w:rPr>
-          <w:rStyle w:val="HTMLCode"/>
-          <w:color w:val="202124"/>
-        </w:rPr>
-        <w:t>│</w:t>
-      </w:r>
-    </w:p>
-    <w:p>
-      <w:pPr>
-        <w:pStyle w:val="HTMLPreformatted"/>
-        <w:rPr>
-          <w:rStyle w:val="HTMLCode"/>
-          <w:color w:val="202124"/>
-        </w:rPr>
-      </w:pPr>
-      <w:r>
-        <w:rPr>
-          <w:rStyle w:val="HTMLCode"/>
-          <w:color w:val="202124"/>
-        </w:rPr>
-        <w:t xml:space="preserve">       │    (Gemini 2.5)      │   │    Agent (Gemini 2.5)│</w:t>
-      </w:r>
-    </w:p>
-    <w:p>
-      <w:pPr>
-        <w:pStyle w:val="HTMLPreformatted"/>
-        <w:rPr>
-          <w:rStyle w:val="HTMLCode"/>
-          <w:color w:val="202124"/>
-        </w:rPr>
-      </w:pPr>
-      <w:r>
-        <w:rPr>
-          <w:rStyle w:val="HTMLCode"/>
-          <w:color w:val="202124"/>
-        </w:rPr>
-        <w:t xml:space="preserve">       </w:t>
-      </w:r>
-      <w:r>
-        <w:rPr>
-          <w:rStyle w:val="HTMLCode"/>
-          <w:color w:val="202124"/>
-        </w:rPr>
-        <w:t>│</w:t>
-      </w:r>
-      <w:r>
-        <w:rPr>
-          <w:rStyle w:val="HTMLCode"/>
-          <w:color w:val="202124"/>
-        </w:rPr>
-        <w:t xml:space="preserve">  - registration      </w:t>
-      </w:r>
-      <w:r>
-        <w:rPr>
-          <w:rStyle w:val="HTMLCode"/>
-          <w:color w:val="202124"/>
-        </w:rPr>
-        <w:t>│</w:t>
-      </w:r>
-      <w:r>
-        <w:rPr>
-          <w:rStyle w:val="HTMLCode"/>
-          <w:color w:val="202124"/>
-        </w:rPr>
-        <w:t xml:space="preserve">   </w:t>
-      </w:r>
-      <w:r>
-        <w:rPr>
-          <w:rStyle w:val="HTMLCode"/>
-          <w:color w:val="202124"/>
-        </w:rPr>
-        <w:t>│</w:t>
-      </w:r>
-      <w:r>
-        <w:rPr>
-          <w:rStyle w:val="HTMLCode"/>
-          <w:color w:val="202124"/>
-        </w:rPr>
-        <w:t xml:space="preserve">  - name mismatch     </w:t>
-      </w:r>
-      <w:r>
-        <w:rPr>
-          <w:rStyle w:val="HTMLCode"/>
-          <w:color w:val="202124"/>
-        </w:rPr>
-        <w:t>│</w:t>
-      </w:r>
-    </w:p>
-    <w:p>
-      <w:pPr>
-        <w:pStyle w:val="HTMLPreformatted"/>
-        <w:rPr>
-          <w:rStyle w:val="HTMLCode"/>
-          <w:color w:val="202124"/>
-        </w:rPr>
-      </w:pPr>
-      <w:r>
-        <w:rPr>
-          <w:rStyle w:val="HTMLCode"/>
-          <w:color w:val="202124"/>
-        </w:rPr>
-        <w:t xml:space="preserve">       </w:t>
-      </w:r>
-      <w:r>
-        <w:rPr>
-          <w:rStyle w:val="HTMLCode"/>
-          <w:color w:val="202124"/>
-        </w:rPr>
-        <w:t>│</w:t>
-      </w:r>
-      <w:r>
-        <w:rPr>
-          <w:rStyle w:val="HTMLCode"/>
-          <w:color w:val="202124"/>
-        </w:rPr>
-        <w:t xml:space="preserve">  - stamp duty        </w:t>
-      </w:r>
-      <w:r>
-        <w:rPr>
-          <w:rStyle w:val="HTMLCode"/>
-          <w:color w:val="202124"/>
-        </w:rPr>
-        <w:t>│</w:t>
-      </w:r>
-      <w:r>
-        <w:rPr>
-          <w:rStyle w:val="HTMLCode"/>
-          <w:color w:val="202124"/>
-        </w:rPr>
-        <w:t xml:space="preserve">   </w:t>
-      </w:r>
-      <w:r>
-        <w:rPr>
-          <w:rStyle w:val="HTMLCode"/>
-          <w:color w:val="202124"/>
-        </w:rPr>
-        <w:t>│</w:t>
-      </w:r>
-      <w:r>
-        <w:rPr>
-          <w:rStyle w:val="HTMLCode"/>
-          <w:color w:val="202124"/>
-        </w:rPr>
-        <w:t xml:space="preserve">  - chain gaps        </w:t>
-      </w:r>
-      <w:r>
-        <w:rPr>
-          <w:rStyle w:val="HTMLCode"/>
-          <w:color w:val="202124"/>
-        </w:rPr>
-        <w:t>│</w:t>
-      </w:r>
-    </w:p>
-    <w:p>
-      <w:pPr>
-        <w:pStyle w:val="HTMLPreformatted"/>
-        <w:rPr>
-          <w:rStyle w:val="HTMLCode"/>
-          <w:color w:val="202124"/>
-        </w:rPr>
-      </w:pPr>
-      <w:r>
-        <w:rPr>
-          <w:rStyle w:val="HTMLCode"/>
-          <w:color w:val="202124"/>
-        </w:rPr>
-        <w:t xml:space="preserve">       </w:t>
-      </w:r>
-      <w:r>
-        <w:rPr>
-          <w:rStyle w:val="HTMLCode"/>
-          <w:color w:val="202124"/>
-        </w:rPr>
-        <w:t>│</w:t>
-      </w:r>
-      <w:r>
-        <w:rPr>
-          <w:rStyle w:val="HTMLCode"/>
-          <w:color w:val="202124"/>
-        </w:rPr>
-        <w:t xml:space="preserve">  </w:t>
-      </w:r>
-      <w:r>
-        <w:rPr>
-          <w:rStyle w:val="HTMLCode"/>
-          <w:color w:val="202124"/>
-        </w:rPr>
-        <w:t xml:space="preserve">- state rules       </w:t>
-      </w:r>
-      <w:r>
-        <w:rPr>
-          <w:rStyle w:val="HTMLCode"/>
-          <w:color w:val="202124"/>
-        </w:rPr>
-        <w:t>│</w:t>
-      </w:r>
-      <w:r>
-        <w:rPr>
-          <w:rStyle w:val="HTMLCode"/>
-          <w:color w:val="202124"/>
-        </w:rPr>
-        <w:t xml:space="preserve">   </w:t>
-      </w:r>
-      <w:r>
-        <w:rPr>
-          <w:rStyle w:val="HTMLCode"/>
-          <w:color w:val="202124"/>
-        </w:rPr>
-        <w:t>│</w:t>
-      </w:r>
-      <w:r>
-        <w:rPr>
-          <w:rStyle w:val="HTMLCode"/>
-          <w:color w:val="202124"/>
-        </w:rPr>
-        <w:t xml:space="preserve">  - undervaluation    </w:t>
-      </w:r>
-      <w:r>
-        <w:rPr>
-          <w:rStyle w:val="HTMLCode"/>
-          <w:color w:val="202124"/>
-        </w:rPr>
-        <w:t>│</w:t>
-      </w:r>
-    </w:p>
-    <w:p>
-      <w:pPr>
-        <w:pStyle w:val="HTMLPreformatted"/>
-        <w:rPr>
-          <w:rStyle w:val="HTMLCode"/>
-          <w:color w:val="202124"/>
-        </w:rPr>
-      </w:pPr>
-      <w:r>
-        <w:rPr>
-          <w:rStyle w:val="HTMLCode"/>
-          <w:color w:val="202124"/>
-        </w:rPr>
-        <w:t xml:space="preserve">       </w:t>
-      </w:r>
-      <w:r>
-        <w:rPr>
-          <w:rStyle w:val="HTMLCode"/>
-          <w:color w:val="202124"/>
-        </w:rPr>
-        <w:t>│</w:t>
-      </w:r>
-      <w:r>
-        <w:rPr>
-          <w:rStyle w:val="HTMLCode"/>
-          <w:color w:val="202124"/>
-        </w:rPr>
-        <w:t xml:space="preserve">  - RERA              </w:t>
-      </w:r>
-      <w:r>
-        <w:rPr>
-          <w:rStyle w:val="HTMLCode"/>
-          <w:color w:val="202124"/>
-        </w:rPr>
-        <w:t>│</w:t>
-      </w:r>
-      <w:r>
-        <w:rPr>
-          <w:rStyle w:val="HTMLCode"/>
-          <w:color w:val="202124"/>
-        </w:rPr>
-        <w:t xml:space="preserve">   </w:t>
-      </w:r>
-      <w:r>
-        <w:rPr>
-          <w:rStyle w:val="HTMLCode"/>
-          <w:color w:val="202124"/>
-        </w:rPr>
-        <w:t>│</w:t>
-      </w:r>
-      <w:r>
-        <w:rPr>
-          <w:rStyle w:val="HTMLCode"/>
-          <w:color w:val="202124"/>
-        </w:rPr>
-        <w:t xml:space="preserve">  - Roshni / tribal   </w:t>
-      </w:r>
-      <w:r>
-        <w:rPr>
-          <w:rStyle w:val="HTMLCode"/>
-          <w:color w:val="202124"/>
-        </w:rPr>
-        <w:t>│</w:t>
-      </w:r>
-    </w:p>
-    <w:p>
-      <w:pPr>
-        <w:pStyle w:val="HTMLPreformatted"/>
-        <w:rPr>
-          <w:rStyle w:val="HTMLCode"/>
-          <w:color w:val="202124"/>
-        </w:rPr>
-      </w:pPr>
-      <w:r>
-        <w:rPr>
-          <w:rStyle w:val="HTMLCode"/>
-          <w:color w:val="202124"/>
-        </w:rPr>
-        <w:t xml:space="preserve">       </w:t>
-      </w:r>
-      <w:r>
-        <w:rPr>
-          <w:rStyle w:val="HTMLCode"/>
-          <w:color w:val="202124"/>
-        </w:rPr>
-        <w:t>│</w:t>
-      </w:r>
-      <w:r>
-        <w:rPr>
-          <w:rStyle w:val="HTMLCode"/>
-          <w:color w:val="202124"/>
-        </w:rPr>
-        <w:t xml:space="preserve">  - per-doc findings  </w:t>
-      </w:r>
-      <w:r>
-        <w:rPr>
-          <w:rStyle w:val="HTMLCode"/>
-          <w:color w:val="202124"/>
-        </w:rPr>
-        <w:t>│</w:t>
-      </w:r>
-      <w:r>
-        <w:rPr>
-          <w:rStyle w:val="HTMLCode"/>
-          <w:color w:val="202124"/>
-        </w:rPr>
-        <w:t xml:space="preserve">   </w:t>
-      </w:r>
-      <w:r>
-        <w:rPr>
-          <w:rStyle w:val="HTMLCode"/>
-          <w:color w:val="202124"/>
-        </w:rPr>
-        <w:t>│</w:t>
-      </w:r>
-      <w:r>
-        <w:rPr>
-          <w:rStyle w:val="HTMLCode"/>
-          <w:color w:val="202124"/>
-        </w:rPr>
-        <w:t xml:space="preserve">  - benami signals    </w:t>
-      </w:r>
-      <w:r>
-        <w:rPr>
-          <w:rStyle w:val="HTMLCode"/>
-          <w:color w:val="202124"/>
-        </w:rPr>
-        <w:t>│</w:t>
-      </w:r>
-    </w:p>
-    <w:p>
-      <w:pPr>
-        <w:pStyle w:val="HTMLPreformatted"/>
-        <w:rPr>
-          <w:rStyle w:val="HTMLCode"/>
-          <w:color w:val="202124"/>
-        </w:rPr>
-      </w:pPr>
-      <w:r>
-        <w:rPr>
-          <w:rStyle w:val="HTMLCode"/>
-          <w:color w:val="202124"/>
-        </w:rPr>
-        <w:t xml:space="preserve">       └──────────┬───────────┘   └──────────┬───────────┘</w:t>
-      </w:r>
-    </w:p>
-    <w:p>
-      <w:pPr>
-        <w:pStyle w:val="HTMLPreformatted"/>
-        <w:rPr>
-          <w:rStyle w:val="HTMLCode"/>
-          <w:color w:val="202124"/>
-        </w:rPr>
-      </w:pPr>
-      <w:r>
-        <w:rPr>
-          <w:rStyle w:val="HTMLCode"/>
-          <w:color w:val="202124"/>
-        </w:rPr>
-        <w:t xml:space="preserve">                  │                          │</w:t>
-      </w:r>
-    </w:p>
-    <w:p>
-      <w:pPr>
-        <w:pStyle w:val="HTMLPreformatted"/>
-        <w:rPr>
-          <w:rStyle w:val="HTMLCode"/>
-          <w:color w:val="202124"/>
-        </w:rPr>
-      </w:pPr>
-      <w:r>
-        <w:rPr>
-          <w:rStyle w:val="HTMLCode"/>
-          <w:color w:val="202124"/>
-        </w:rPr>
-        <w:t xml:space="preserve">                  </w:t>
-      </w:r>
-      <w:r>
-        <w:rPr>
-          <w:rStyle w:val="HTMLCode"/>
-          <w:color w:val="202124"/>
-        </w:rPr>
-        <w:t>└────────────┬─────────────┘</w:t>
-      </w:r>
-    </w:p>
-    <w:p>
-      <w:pPr>
-        <w:pStyle w:val="HTMLPreformatted"/>
-        <w:rPr>
-          <w:rStyle w:val="HTMLCode"/>
-          <w:color w:val="202124"/>
-        </w:rPr>
-      </w:pPr>
-      <w:r>
-        <w:rPr>
-          <w:rStyle w:val="HTMLCode"/>
-          <w:color w:val="202124"/>
-        </w:rPr>
-        <w:t xml:space="preserve">                               │ ③ consolidate + dedupe + grade</w:t>
-      </w:r>
-    </w:p>
-    <w:p>
-      <w:pPr>
-        <w:pStyle w:val="HTMLPreformatted"/>
-        <w:rPr>
-          <w:rStyle w:val="HTMLCode"/>
-          <w:color w:val="202124"/>
-        </w:rPr>
-      </w:pPr>
-      <w:r>
-        <w:rPr>
-          <w:rStyle w:val="HTMLCode"/>
-          <w:color w:val="202124"/>
-        </w:rPr>
-        <w:t xml:space="preserve">                               ▼</w:t>
-      </w:r>
-    </w:p>
-    <w:p>
-      <w:pPr>
-        <w:pStyle w:val="HTMLPreformatted"/>
-        <w:rPr>
-          <w:rStyle w:val="HTMLCode"/>
-          <w:color w:val="202124"/>
-        </w:rPr>
-      </w:pPr>
-      <w:r>
-        <w:rPr>
-          <w:rStyle w:val="HTMLCode"/>
-          <w:color w:val="202124"/>
-        </w:rPr>
-        <w:t xml:space="preserve">            </w:t>
-      </w:r>
-      <w:r>
-        <w:rPr>
-          <w:rStyle w:val="HTMLCode"/>
-          <w:color w:val="202124"/>
-        </w:rPr>
-        <w:t>┌─────────────────────────────────────────────────────────┐</w:t>
-      </w:r>
-    </w:p>
-    <w:p>
-      <w:pPr>
-        <w:pStyle w:val="HTMLPreformatted"/>
-        <w:rPr>
-          <w:rStyle w:val="HTMLCode"/>
-          <w:color w:val="202124"/>
-        </w:rPr>
-      </w:pPr>
-      <w:r>
-        <w:rPr>
-          <w:rStyle w:val="HTMLCode"/>
-          <w:color w:val="202124"/>
-        </w:rPr>
-        <w:t xml:space="preserve">            </w:t>
-      </w:r>
-      <w:r>
-        <w:rPr>
-          <w:rStyle w:val="HTMLCode"/>
-          <w:color w:val="202124"/>
-        </w:rPr>
-        <w:t>│</w:t>
-      </w:r>
-      <w:r>
-        <w:rPr>
-          <w:rStyle w:val="HTMLCode"/>
-          <w:color w:val="202124"/>
-        </w:rPr>
-        <w:t xml:space="preserve">   5.  Report Agent  (Gemini 2.5-flash)                  </w:t>
-      </w:r>
-      <w:r>
-        <w:rPr>
-          <w:rStyle w:val="HTMLCode"/>
-          <w:color w:val="202124"/>
-        </w:rPr>
-        <w:t>│</w:t>
-      </w:r>
-    </w:p>
-    <w:p>
-      <w:pPr>
-        <w:pStyle w:val="HTMLPreformatted"/>
-        <w:rPr>
-          <w:rStyle w:val="HTMLCode"/>
-          <w:color w:val="202124"/>
-        </w:rPr>
-      </w:pPr>
-      <w:r>
-        <w:rPr>
-          <w:rStyle w:val="HTMLCode"/>
-          <w:color w:val="202124"/>
-        </w:rPr>
-        <w:t xml:space="preserve">            │       - lawyer-style summary                            │</w:t>
-      </w:r>
-    </w:p>
-    <w:p>
-      <w:pPr>
-        <w:pStyle w:val="HTMLPreformatted"/>
-        <w:rPr>
-          <w:rStyle w:val="HTMLCode"/>
-          <w:color w:val="202124"/>
-        </w:rPr>
-      </w:pPr>
-      <w:r>
-        <w:rPr>
-          <w:rStyle w:val="HTMLCode"/>
-          <w:color w:val="202124"/>
-        </w:rPr>
-        <w:t xml:space="preserve">            </w:t>
-      </w:r>
-      <w:r>
-        <w:rPr>
-          <w:rStyle w:val="HTMLCode"/>
-          <w:color w:val="202124"/>
-        </w:rPr>
-        <w:t>│</w:t>
-      </w:r>
-      <w:r>
-        <w:rPr>
-          <w:rStyle w:val="HTMLCode"/>
-          <w:color w:val="202124"/>
-        </w:rPr>
-        <w:t xml:space="preserve">       - severity counts (low/medium/high/critical)      </w:t>
-      </w:r>
-      <w:r>
-        <w:rPr>
-          <w:rStyle w:val="HTMLCode"/>
-          <w:color w:val="202124"/>
-        </w:rPr>
-        <w:t>│</w:t>
-      </w:r>
-    </w:p>
-    <w:p>
-      <w:pPr>
-        <w:pStyle w:val="HTMLPreformatted"/>
-        <w:rPr>
-          <w:rStyle w:val="HTMLCode"/>
-          <w:color w:val="202124"/>
-        </w:rPr>
-      </w:pPr>
-      <w:r>
-        <w:rPr>
-          <w:rStyle w:val="HTMLCode"/>
-          <w:color w:val="202124"/>
-        </w:rPr>
-        <w:t xml:space="preserve">            │       - verdict: go / clarify / stop                    │</w:t>
-      </w:r>
-    </w:p>
-    <w:p>
-      <w:pPr>
-        <w:pStyle w:val="HTMLPreformatted"/>
-        <w:rPr>
-          <w:rStyle w:val="HTMLCode"/>
-          <w:color w:val="202124"/>
-        </w:rPr>
-      </w:pPr>
-      <w:r>
-        <w:rPr>
-          <w:rStyle w:val="HTMLCode"/>
-          <w:color w:val="202124"/>
-        </w:rPr>
-        <w:t xml:space="preserve">            │       - recommended next steps                          │</w:t>
-      </w:r>
-    </w:p>
-    <w:p>
-      <w:pPr>
-        <w:pStyle w:val="HTMLPreformatted"/>
-        <w:rPr>
-          <w:rStyle w:val="HTMLCode"/>
-          <w:color w:val="202124"/>
-        </w:rPr>
-      </w:pPr>
-      <w:r>
-        <w:rPr>
-          <w:rStyle w:val="HTMLCode"/>
-          <w:color w:val="202124"/>
-        </w:rPr>
-        <w:t xml:space="preserve">            </w:t>
-      </w:r>
-      <w:r>
-        <w:rPr>
-          <w:rStyle w:val="HTMLCode"/>
-          <w:color w:val="202124"/>
-        </w:rPr>
-        <w:t>└────────┬────────────────────────────────────────────────┘</w:t>
-      </w:r>
-    </w:p>
-    <w:p>
-      <w:pPr>
-        <w:pStyle w:val="HTMLPreformatted"/>
-        <w:rPr>
-          <w:rStyle w:val="HTMLCode"/>
-          <w:color w:val="202124"/>
-        </w:rPr>
-      </w:pPr>
-      <w:r>
-        <w:rPr>
-          <w:rStyle w:val="HTMLCode"/>
-          <w:color w:val="202124"/>
-        </w:rPr>
-        <w:t xml:space="preserve">                     │ ④ persist + stream</w:t>
-      </w:r>
-    </w:p>
-    <w:p>
-      <w:pPr>
-        <w:pStyle w:val="HTMLPreformatted"/>
-        <w:rPr>
-          <w:rStyle w:val="HTMLCode"/>
-          <w:color w:val="202124"/>
-        </w:rPr>
-      </w:pPr>
-      <w:r>
-        <w:rPr>
-          <w:rStyle w:val="HTMLCode"/>
-          <w:color w:val="202124"/>
-        </w:rPr>
-        <w:t xml:space="preserve">                     ▼</w:t>
-      </w:r>
-    </w:p>
-    <w:p>
-      <w:pPr>
-        <w:pStyle w:val="HTMLPreformatted"/>
-        <w:rPr>
-          <w:rStyle w:val="HTMLCode"/>
-          <w:color w:val="202124"/>
-        </w:rPr>
-      </w:pPr>
-      <w:r>
-        <w:rPr>
-          <w:rStyle w:val="HTMLCode"/>
-          <w:color w:val="202124"/>
-        </w:rPr>
-        <w:t xml:space="preserve">              Firestore (findings, audit)  ──►  Frontend (SSE)</w:t>
-      </w:r>
-    </w:p>
-    <w:p>
-      <w:pPr>
-        <w:pStyle w:val="HTMLPreformatted"/>
-        <w:rPr>
-          <w:color w:val="202124"/>
-        </w:rPr>
-      </w:pPr>
-      <w:r>
-        <w:rPr>
-          <w:rStyle w:val="HTMLCode"/>
-          <w:color w:val="202124"/>
-        </w:rPr>
-        <w:t xml:space="preserve">              Pub/Sub (fraud alerts)       ──►  BigQuery analytics</w:t>
+        <w:pStyle w:val="NormalWeb"/>
+        <w:rPr>
+          <w:rFonts w:ascii="Calibri" w:hAnsi="Calibri" w:cs="Calibri"/>
+          <w:color w:val="202124"/>
+          <w:sz w:val="22"/>
+          <w:szCs w:val="22"/>
+        </w:rPr>
+      </w:pPr>
+      <w:r>
+        <w:rPr>
+          <w:rFonts w:ascii="Calibri" w:hAnsi="Calibri" w:cs="Calibri"/>
+          <w:noProof/>
+          <w:color w:val="202124"/>
+          <w:sz w:val="22"/>
+          <w:szCs w:val="22"/>
+        </w:rPr>
+        <w:drawing>
+          <wp:inline distT="0" distB="0" distL="0" distR="0" wp14:anchorId="4D7CCDE3" wp14:editId="47F35548">
+            <wp:extent cx="12192627" cy="6858352"/>
+            <wp:effectExtent l="0" t="0" r="0" b="0"/>
+            <wp:docPr id="5" name="Picture 5" descr="Agent flow diagram"/>
+            <wp:cNvGraphicFramePr>
+              <a:graphicFrameLocks xmlns:a="http://schemas.openxmlformats.org/drawingml/2006/main" noChangeAspect="1"/>
+            </wp:cNvGraphicFramePr>
+            <a:graphic xmlns:a="http://schemas.openxmlformats.org/drawingml/2006/main">
+              <a:graphicData uri="http://schemas.openxmlformats.org/drawingml/2006/picture">
+                <pic:pic xmlns:pic="http://schemas.openxmlformats.org/drawingml/2006/picture">
+                  <pic:nvPicPr>
+                    <pic:cNvPr id="0" name="Picture 5" descr="Agent flow diagram"/>
+                    <pic:cNvPicPr>
+                      <a:picLocks noChangeAspect="1" noChangeArrowheads="1"/>
+                    </pic:cNvPicPr>
+                  </pic:nvPicPr>
+                  <pic:blipFill>
+                    <a:blip r:link="rId5">
+                      <a:extLst>
+                        <a:ext uri="{28A0092B-C50C-407E-A947-70E740481C1C}">
+                          <a14:useLocalDpi xmlns:a14="http://schemas.microsoft.com/office/drawing/2010/main" val="0"/>
+                        </a:ext>
+                      </a:extLst>
+                    </a:blip>
+                    <a:srcRect/>
+                    <a:stretch>
+                      <a:fillRect/>
+                    </a:stretch>
+                  </pic:blipFill>
+                  <pic:spPr bwMode="auto">
+                    <a:xfrm>
+                      <a:off x="0" y="0"/>
+                      <a:ext cx="12192627" cy="6858352"/>
+                    </a:xfrm>
+                    <a:prstGeom prst="rect">
+                      <a:avLst/>
+                    </a:prstGeom>
+                    <a:noFill/>
+                    <a:ln>
+                      <a:noFill/>
+                    </a:ln>
+                  </pic:spPr>
+                </pic:pic>
+              </a:graphicData>
+            </a:graphic>
+          </wp:inline>
+        </w:drawing>
       </w:r>
     </w:p>
     <w:p>
@@ -2523,6 +1463,7 @@
           <w:sz w:val="22"/>
           <w:szCs w:val="22"/>
         </w:rPr>
+        <w:lastRenderedPageBreak/>
         <w:t>Buyer signs in (Firebase Auth) and uploads a bundle (sale deed, EC, mutation, tax receipts, building plan).</w:t>
       </w:r>
     </w:p>
@@ -2832,8 +1773,8 @@
           <w:sz w:val="22"/>
           <w:szCs w:val="22"/>
         </w:rPr>
-        <w:pict w14:anchorId="3C4DB120">
-          <v:rect id="_x0000_i1029" style="width:0;height:1.5pt" o:hralign="center" o:hrstd="t" o:hr="t" fillcolor="#a0a0a0" stroked="f"/>
+        <w:pict w14:anchorId="5D1B8080">
+          <v:rect id="_x0000_i1030" style="width:0;height:1.5pt" o:hralign="center" o:hrstd="t" o:hr="t" fillcolor="#a0a0a0" stroked="f"/>
         </w:pict>
       </w:r>
     </w:p>
@@ -2853,1238 +1794,71 @@
     </w:p>
     <w:p>
       <w:pPr>
-        <w:pStyle w:val="HTMLPreformatted"/>
-        <w:rPr>
-          <w:rStyle w:val="HTMLCode"/>
-          <w:color w:val="202124"/>
-        </w:rPr>
-      </w:pPr>
-      <w:r>
-        <w:rPr>
-          <w:rStyle w:val="HTMLCode"/>
-          <w:color w:val="202124"/>
-        </w:rPr>
-        <w:t>┌──────────────────────────────────────────────────────────────────────────┐</w:t>
-      </w:r>
-    </w:p>
-    <w:p>
-      <w:pPr>
-        <w:pStyle w:val="HTMLPreformatted"/>
-        <w:rPr>
-          <w:rStyle w:val="HTMLCode"/>
-          <w:color w:val="202124"/>
-        </w:rPr>
-      </w:pPr>
-      <w:r>
-        <w:rPr>
-          <w:rStyle w:val="HTMLCode"/>
-          <w:color w:val="202124"/>
-        </w:rPr>
-        <w:t>│</w:t>
-      </w:r>
-      <w:r>
-        <w:rPr>
-          <w:rStyle w:val="HTMLCode"/>
-          <w:color w:val="202124"/>
-        </w:rPr>
-        <w:t xml:space="preserve">  PRESENTATION LAYER                                                      </w:t>
-      </w:r>
-      <w:r>
-        <w:rPr>
-          <w:rStyle w:val="HTMLCode"/>
-          <w:color w:val="202124"/>
-        </w:rPr>
-        <w:t>│</w:t>
-      </w:r>
-    </w:p>
-    <w:p>
-      <w:pPr>
-        <w:pStyle w:val="HTMLPreformatted"/>
-        <w:rPr>
-          <w:rStyle w:val="HTMLCode"/>
-          <w:color w:val="202124"/>
-        </w:rPr>
-      </w:pPr>
-      <w:r>
-        <w:rPr>
-          <w:rStyle w:val="HTMLCode"/>
-          <w:color w:val="202124"/>
-        </w:rPr>
-        <w:t>│</w:t>
-      </w:r>
-      <w:r>
-        <w:rPr>
-          <w:rStyle w:val="HTMLCode"/>
-          <w:color w:val="202124"/>
-        </w:rPr>
-        <w:t xml:space="preserve">  Next.js (Cloud Run) · Firebase Authentication · CDN                     </w:t>
-      </w:r>
-      <w:r>
-        <w:rPr>
-          <w:rStyle w:val="HTMLCode"/>
-          <w:color w:val="202124"/>
-        </w:rPr>
-        <w:t>│</w:t>
-      </w:r>
-    </w:p>
-    <w:p>
-      <w:pPr>
-        <w:pStyle w:val="HTMLPreformatted"/>
-        <w:rPr>
-          <w:rStyle w:val="HTMLCode"/>
-          <w:color w:val="202124"/>
-        </w:rPr>
-      </w:pPr>
-      <w:r>
-        <w:rPr>
-          <w:rStyle w:val="HTMLCode"/>
-          <w:color w:val="202124"/>
-        </w:rPr>
-        <w:t>└──────────────────────────────────┬───────────────────────────────────────┘</w:t>
-      </w:r>
-    </w:p>
-    <w:p>
-      <w:pPr>
-        <w:pStyle w:val="HTMLPreformatted"/>
-        <w:rPr>
-          <w:rStyle w:val="HTMLCode"/>
-          <w:color w:val="202124"/>
-        </w:rPr>
-      </w:pPr>
-      <w:r>
-        <w:rPr>
-          <w:rStyle w:val="HTMLCode"/>
-          <w:color w:val="202124"/>
-        </w:rPr>
-        <w:t xml:space="preserve">                                   │  HTTPS + ID token</w:t>
-      </w:r>
-    </w:p>
-    <w:p>
-      <w:pPr>
-        <w:pStyle w:val="HTMLPreformatted"/>
-        <w:rPr>
-          <w:rStyle w:val="HTMLCode"/>
-          <w:color w:val="202124"/>
-        </w:rPr>
-      </w:pPr>
-      <w:r>
-        <w:rPr>
-          <w:rStyle w:val="HTMLCode"/>
-          <w:color w:val="202124"/>
-        </w:rPr>
-        <w:t xml:space="preserve">                                   </w:t>
-      </w:r>
-      <w:r>
-        <w:rPr>
-          <w:rStyle w:val="HTMLCode"/>
-          <w:color w:val="202124"/>
-        </w:rPr>
-        <w:t>▼</w:t>
-      </w:r>
-    </w:p>
-    <w:p>
-      <w:pPr>
-        <w:pStyle w:val="HTMLPreformatted"/>
-        <w:rPr>
-          <w:rStyle w:val="HTMLCode"/>
-          <w:color w:val="202124"/>
-        </w:rPr>
-      </w:pPr>
-      <w:r>
-        <w:rPr>
-          <w:rStyle w:val="HTMLCode"/>
-          <w:color w:val="202124"/>
-        </w:rPr>
-        <w:t>┌──────────────────────────────────────────────────────────────────────────┐</w:t>
-      </w:r>
-    </w:p>
-    <w:p>
-      <w:pPr>
-        <w:pStyle w:val="HTMLPreformatted"/>
-        <w:rPr>
-          <w:rStyle w:val="HTMLCode"/>
-          <w:color w:val="202124"/>
-        </w:rPr>
-      </w:pPr>
-      <w:r>
-        <w:rPr>
-          <w:rStyle w:val="HTMLCode"/>
-          <w:color w:val="202124"/>
-        </w:rPr>
-        <w:t>│</w:t>
-      </w:r>
-      <w:r>
-        <w:rPr>
-          <w:rStyle w:val="HTMLCode"/>
-          <w:color w:val="202124"/>
-        </w:rPr>
-        <w:t xml:space="preserve">  ORCHESTRATION LAYER                                                     </w:t>
-      </w:r>
-      <w:r>
-        <w:rPr>
-          <w:rStyle w:val="HTMLCode"/>
-          <w:color w:val="202124"/>
-        </w:rPr>
-        <w:t>│</w:t>
-      </w:r>
-    </w:p>
-    <w:p>
-      <w:pPr>
-        <w:pStyle w:val="HTMLPreformatted"/>
-        <w:rPr>
-          <w:rStyle w:val="HTMLCode"/>
-          <w:color w:val="202124"/>
-        </w:rPr>
-      </w:pPr>
-      <w:r>
-        <w:rPr>
-          <w:rStyle w:val="HTMLCode"/>
-          <w:color w:val="202124"/>
-        </w:rPr>
-        <w:t>│  FastAPI API (Cloud Run) · SSE streaming · request validation            │</w:t>
-      </w:r>
-    </w:p>
-    <w:p>
-      <w:pPr>
-        <w:pStyle w:val="HTMLPreformatted"/>
-        <w:rPr>
-          <w:rStyle w:val="HTMLCode"/>
-          <w:color w:val="202124"/>
-        </w:rPr>
-      </w:pPr>
-      <w:r>
-        <w:rPr>
-          <w:rStyle w:val="HTMLCode"/>
-          <w:color w:val="202124"/>
-        </w:rPr>
-        <w:t>└──────┬─────────────────────────────────────────────────┬─────────────────┘</w:t>
-      </w:r>
-    </w:p>
-    <w:p>
-      <w:pPr>
-        <w:pStyle w:val="HTMLPreformatted"/>
-        <w:rPr>
-          <w:rStyle w:val="HTMLCode"/>
-          <w:color w:val="202124"/>
-        </w:rPr>
-      </w:pPr>
-      <w:r>
-        <w:rPr>
-          <w:rStyle w:val="HTMLCode"/>
-          <w:color w:val="202124"/>
-        </w:rPr>
-        <w:t xml:space="preserve">       │ publish job                                     │ direct (small)</w:t>
-      </w:r>
-    </w:p>
-    <w:p>
-      <w:pPr>
-        <w:pStyle w:val="HTMLPreformatted"/>
-        <w:rPr>
-          <w:rStyle w:val="HTMLCode"/>
-          <w:color w:val="202124"/>
-        </w:rPr>
-      </w:pPr>
-      <w:r>
-        <w:rPr>
-          <w:rStyle w:val="HTMLCode"/>
-          <w:color w:val="202124"/>
-        </w:rPr>
-        <w:t xml:space="preserve">       </w:t>
-      </w:r>
-      <w:r>
-        <w:rPr>
-          <w:rStyle w:val="HTMLCode"/>
-          <w:color w:val="202124"/>
-        </w:rPr>
-        <w:t>▼</w:t>
-      </w:r>
-      <w:r>
-        <w:rPr>
-          <w:rStyle w:val="HTMLCode"/>
-          <w:color w:val="202124"/>
-        </w:rPr>
-        <w:t xml:space="preserve">                                                 </w:t>
-      </w:r>
-      <w:r>
-        <w:rPr>
-          <w:rStyle w:val="HTMLCode"/>
-          <w:color w:val="202124"/>
-        </w:rPr>
-        <w:t>│</w:t>
-      </w:r>
-    </w:p>
-    <w:p>
-      <w:pPr>
-        <w:pStyle w:val="HTMLPreformatted"/>
-        <w:rPr>
-          <w:rStyle w:val="HTMLCode"/>
-          <w:color w:val="202124"/>
-        </w:rPr>
-      </w:pPr>
-      <w:r>
-        <w:rPr>
-          <w:rStyle w:val="HTMLCode"/>
-          <w:color w:val="202124"/>
-        </w:rPr>
-        <w:t>┌──────────────────┐</w:t>
-      </w:r>
-      <w:r>
-        <w:rPr>
-          <w:rStyle w:val="HTMLCode"/>
-          <w:color w:val="202124"/>
-        </w:rPr>
-        <w:t xml:space="preserve">                                     </w:t>
-      </w:r>
-      <w:r>
-        <w:rPr>
-          <w:rStyle w:val="HTMLCode"/>
-          <w:color w:val="202124"/>
-        </w:rPr>
-        <w:t>│</w:t>
-      </w:r>
-    </w:p>
-    <w:p>
-      <w:pPr>
-        <w:pStyle w:val="HTMLPreformatted"/>
-        <w:rPr>
-          <w:rStyle w:val="HTMLCode"/>
-          <w:color w:val="202124"/>
-        </w:rPr>
-      </w:pPr>
-      <w:r>
-        <w:rPr>
-          <w:rStyle w:val="HTMLCode"/>
-          <w:color w:val="202124"/>
-        </w:rPr>
-        <w:t>│  Pub/Sub         │  topics: analysis_jobs · fraud_alert · embedding_jobs│</w:t>
-      </w:r>
-    </w:p>
-    <w:p>
-      <w:pPr>
-        <w:pStyle w:val="HTMLPreformatted"/>
-        <w:rPr>
-          <w:rStyle w:val="HTMLCode"/>
-          <w:color w:val="202124"/>
-        </w:rPr>
-      </w:pPr>
-      <w:r>
-        <w:rPr>
-          <w:rStyle w:val="HTMLCode"/>
-          <w:color w:val="202124"/>
-        </w:rPr>
-        <w:t>│</w:t>
-      </w:r>
-      <w:r>
-        <w:rPr>
-          <w:rStyle w:val="HTMLCode"/>
-          <w:color w:val="202124"/>
-        </w:rPr>
-        <w:t xml:space="preserve">  + DLQ           </w:t>
-      </w:r>
-      <w:r>
-        <w:rPr>
-          <w:rStyle w:val="HTMLCode"/>
-          <w:color w:val="202124"/>
-        </w:rPr>
-        <w:t>│</w:t>
-      </w:r>
-      <w:r>
-        <w:rPr>
-          <w:rStyle w:val="HTMLCode"/>
-          <w:color w:val="202124"/>
-        </w:rPr>
-        <w:t xml:space="preserve">  decouples bursts, retries, fan-out                  </w:t>
-      </w:r>
-      <w:r>
-        <w:rPr>
-          <w:rStyle w:val="HTMLCode"/>
-          <w:color w:val="202124"/>
-        </w:rPr>
-        <w:t>│</w:t>
-      </w:r>
-    </w:p>
-    <w:p>
-      <w:pPr>
-        <w:pStyle w:val="HTMLPreformatted"/>
-        <w:rPr>
-          <w:rStyle w:val="HTMLCode"/>
-          <w:color w:val="202124"/>
-        </w:rPr>
-      </w:pPr>
-      <w:r>
-        <w:rPr>
-          <w:rStyle w:val="HTMLCode"/>
-          <w:color w:val="202124"/>
-        </w:rPr>
-        <w:t>└────────┬─────────┘                                     │</w:t>
-      </w:r>
-    </w:p>
-    <w:p>
-      <w:pPr>
-        <w:pStyle w:val="HTMLPreformatted"/>
-        <w:rPr>
-          <w:rStyle w:val="HTMLCode"/>
-          <w:color w:val="202124"/>
-        </w:rPr>
-      </w:pPr>
-      <w:r>
-        <w:rPr>
-          <w:rStyle w:val="HTMLCode"/>
-          <w:color w:val="202124"/>
-        </w:rPr>
-        <w:t xml:space="preserve">         │ pull                                          │</w:t>
-      </w:r>
-    </w:p>
-    <w:p>
-      <w:pPr>
-        <w:pStyle w:val="HTMLPreformatted"/>
-        <w:rPr>
-          <w:rStyle w:val="HTMLCode"/>
-          <w:color w:val="202124"/>
-        </w:rPr>
-      </w:pPr>
-      <w:r>
-        <w:rPr>
-          <w:rStyle w:val="HTMLCode"/>
-          <w:color w:val="202124"/>
-        </w:rPr>
-        <w:t xml:space="preserve">         ▼                                                ▼</w:t>
-      </w:r>
-    </w:p>
-    <w:p>
-      <w:pPr>
-        <w:pStyle w:val="HTMLPreformatted"/>
-        <w:rPr>
-          <w:rStyle w:val="HTMLCode"/>
-          <w:color w:val="202124"/>
-        </w:rPr>
-      </w:pPr>
-      <w:r>
-        <w:rPr>
-          <w:rStyle w:val="HTMLCode"/>
-          <w:color w:val="202124"/>
-        </w:rPr>
-        <w:t>┌──────────────────────────────────────────────────────────────────────────┐</w:t>
-      </w:r>
-    </w:p>
-    <w:p>
-      <w:pPr>
-        <w:pStyle w:val="HTMLPreformatted"/>
-        <w:rPr>
-          <w:rStyle w:val="HTMLCode"/>
-          <w:color w:val="202124"/>
-        </w:rPr>
-      </w:pPr>
-      <w:r>
-        <w:rPr>
-          <w:rStyle w:val="HTMLCode"/>
-          <w:color w:val="202124"/>
-        </w:rPr>
-        <w:t>│  AGENT LAYER  (Cloud Run worker, auto-scale 0 → N)                       │</w:t>
-      </w:r>
-    </w:p>
-    <w:p>
-      <w:pPr>
-        <w:pStyle w:val="HTMLPreformatted"/>
-        <w:rPr>
-          <w:rStyle w:val="HTMLCode"/>
-          <w:color w:val="202124"/>
-        </w:rPr>
-      </w:pPr>
-      <w:r>
-        <w:rPr>
-          <w:rStyle w:val="HTMLCode"/>
-          <w:color w:val="202124"/>
-        </w:rPr>
-        <w:t>│                                                                          │</w:t>
-      </w:r>
-    </w:p>
-    <w:p>
-      <w:pPr>
-        <w:pStyle w:val="HTMLPreformatted"/>
-        <w:rPr>
-          <w:rStyle w:val="HTMLCode"/>
-          <w:color w:val="202124"/>
-        </w:rPr>
-      </w:pPr>
-      <w:r>
-        <w:rPr>
-          <w:rStyle w:val="HTMLCode"/>
-          <w:color w:val="202124"/>
-        </w:rPr>
-        <w:t>│    Vertex AI Gemini 2.5-flash                                            │</w:t>
-      </w:r>
-    </w:p>
-    <w:p>
-      <w:pPr>
-        <w:pStyle w:val="HTMLPreformatted"/>
-        <w:rPr>
-          <w:rStyle w:val="HTMLCode"/>
-          <w:color w:val="202124"/>
-        </w:rPr>
-      </w:pPr>
-      <w:r>
-        <w:rPr>
-          <w:rStyle w:val="HTMLCode"/>
-          <w:color w:val="202124"/>
-        </w:rPr>
-        <w:t>│</w:t>
-      </w:r>
-      <w:r>
-        <w:rPr>
-          <w:rStyle w:val="HTMLCode"/>
-          <w:color w:val="202124"/>
-        </w:rPr>
-        <w:t xml:space="preserve">    </w:t>
-      </w:r>
-      <w:r>
-        <w:rPr>
-          <w:rStyle w:val="HTMLCode"/>
-          <w:color w:val="202124"/>
-        </w:rPr>
-        <w:t>┌──────────┐</w:t>
-      </w:r>
-      <w:r>
-        <w:rPr>
-          <w:rStyle w:val="HTMLCode"/>
-          <w:color w:val="202124"/>
-        </w:rPr>
-        <w:t xml:space="preserve">  </w:t>
-      </w:r>
-      <w:r>
-        <w:rPr>
-          <w:rStyle w:val="HTMLCode"/>
-          <w:color w:val="202124"/>
-        </w:rPr>
-        <w:t>┌──────────────┐</w:t>
-      </w:r>
-      <w:r>
-        <w:rPr>
-          <w:rStyle w:val="HTMLCode"/>
-          <w:color w:val="202124"/>
-        </w:rPr>
-        <w:t xml:space="preserve">  </w:t>
-      </w:r>
-      <w:r>
-        <w:rPr>
-          <w:rStyle w:val="HTMLCode"/>
-          <w:color w:val="202124"/>
-        </w:rPr>
-        <w:t>┌──────────────┐</w:t>
-      </w:r>
-      <w:r>
-        <w:rPr>
-          <w:rStyle w:val="HTMLCode"/>
-          <w:color w:val="202124"/>
-        </w:rPr>
-        <w:t xml:space="preserve">  </w:t>
-      </w:r>
-      <w:r>
-        <w:rPr>
-          <w:rStyle w:val="HTMLCode"/>
-          <w:color w:val="202124"/>
-        </w:rPr>
-        <w:t>┌──────────┐</w:t>
-      </w:r>
-      <w:r>
-        <w:rPr>
-          <w:rStyle w:val="HTMLCode"/>
-          <w:color w:val="202124"/>
-        </w:rPr>
-        <w:t xml:space="preserve">        </w:t>
-      </w:r>
-      <w:r>
-        <w:rPr>
-          <w:rStyle w:val="HTMLCode"/>
-          <w:color w:val="202124"/>
-        </w:rPr>
-        <w:t>│</w:t>
-      </w:r>
-    </w:p>
-    <w:p>
-      <w:pPr>
-        <w:pStyle w:val="HTMLPreformatted"/>
-        <w:rPr>
-          <w:rStyle w:val="HTMLCode"/>
-          <w:color w:val="202124"/>
-        </w:rPr>
-      </w:pPr>
-      <w:r>
-        <w:rPr>
-          <w:rStyle w:val="HTMLCode"/>
-          <w:color w:val="202124"/>
-        </w:rPr>
-        <w:t>│</w:t>
-      </w:r>
-      <w:r>
-        <w:rPr>
-          <w:rStyle w:val="HTMLCode"/>
-          <w:color w:val="202124"/>
-        </w:rPr>
-        <w:t xml:space="preserve">    </w:t>
-      </w:r>
-      <w:r>
-        <w:rPr>
-          <w:rStyle w:val="HTMLCode"/>
-          <w:color w:val="202124"/>
-        </w:rPr>
-        <w:t>│</w:t>
-      </w:r>
-      <w:r>
-        <w:rPr>
-          <w:rStyle w:val="HTMLCode"/>
-          <w:color w:val="202124"/>
-        </w:rPr>
-        <w:t xml:space="preserve">  Parser  </w:t>
-      </w:r>
-      <w:r>
-        <w:rPr>
-          <w:rStyle w:val="HTMLCode"/>
-          <w:color w:val="202124"/>
-        </w:rPr>
-        <w:t>│</w:t>
-      </w:r>
-      <w:r>
-        <w:rPr>
-          <w:rStyle w:val="HTMLCode"/>
-          <w:color w:val="202124"/>
-        </w:rPr>
-        <w:t xml:space="preserve">  </w:t>
-      </w:r>
-      <w:r>
-        <w:rPr>
-          <w:rStyle w:val="HTMLCode"/>
-          <w:color w:val="202124"/>
-        </w:rPr>
-        <w:t>│ Legal Rules</w:t>
-      </w:r>
-      <w:r>
-        <w:rPr>
-          <w:rStyle w:val="HTMLCode"/>
-          <w:color w:val="202124"/>
-        </w:rPr>
-        <w:t xml:space="preserve">  </w:t>
-      </w:r>
-      <w:r>
-        <w:rPr>
-          <w:rStyle w:val="HTMLCode"/>
-          <w:color w:val="202124"/>
-        </w:rPr>
-        <w:t>│</w:t>
-      </w:r>
-      <w:r>
-        <w:rPr>
-          <w:rStyle w:val="HTMLCode"/>
-          <w:color w:val="202124"/>
-        </w:rPr>
-        <w:t xml:space="preserve">  </w:t>
-      </w:r>
-      <w:r>
-        <w:rPr>
-          <w:rStyle w:val="HTMLCode"/>
-          <w:color w:val="202124"/>
-        </w:rPr>
-        <w:t>│</w:t>
-      </w:r>
-      <w:r>
-        <w:rPr>
-          <w:rStyle w:val="HTMLCode"/>
-          <w:color w:val="202124"/>
-        </w:rPr>
-        <w:t xml:space="preserve">   Fraud      </w:t>
-      </w:r>
-      <w:r>
-        <w:rPr>
-          <w:rStyle w:val="HTMLCode"/>
-          <w:color w:val="202124"/>
-        </w:rPr>
-        <w:t>│</w:t>
-      </w:r>
-      <w:r>
-        <w:rPr>
-          <w:rStyle w:val="HTMLCode"/>
-          <w:color w:val="202124"/>
-        </w:rPr>
-        <w:t xml:space="preserve">  </w:t>
-      </w:r>
-      <w:r>
-        <w:rPr>
-          <w:rStyle w:val="HTMLCode"/>
-          <w:color w:val="202124"/>
-        </w:rPr>
-        <w:t>│</w:t>
-      </w:r>
-      <w:r>
-        <w:rPr>
-          <w:rStyle w:val="HTMLCode"/>
-          <w:color w:val="202124"/>
-        </w:rPr>
-        <w:t xml:space="preserve">  Report  </w:t>
-      </w:r>
-      <w:r>
-        <w:rPr>
-          <w:rStyle w:val="HTMLCode"/>
-          <w:color w:val="202124"/>
-        </w:rPr>
-        <w:t>│</w:t>
-      </w:r>
-      <w:r>
-        <w:rPr>
-          <w:rStyle w:val="HTMLCode"/>
-          <w:color w:val="202124"/>
-        </w:rPr>
-        <w:t xml:space="preserve">        </w:t>
-      </w:r>
-      <w:r>
-        <w:rPr>
-          <w:rStyle w:val="HTMLCode"/>
-          <w:color w:val="202124"/>
-        </w:rPr>
-        <w:t>│</w:t>
-      </w:r>
-    </w:p>
-    <w:p>
-      <w:pPr>
-        <w:pStyle w:val="HTMLPreformatted"/>
-        <w:rPr>
-          <w:rStyle w:val="HTMLCode"/>
-          <w:color w:val="202124"/>
-        </w:rPr>
-      </w:pPr>
-      <w:r>
-        <w:rPr>
-          <w:rStyle w:val="HTMLCode"/>
-          <w:color w:val="202124"/>
-        </w:rPr>
-        <w:t>│</w:t>
-      </w:r>
-      <w:r>
-        <w:rPr>
-          <w:rStyle w:val="HTMLCode"/>
-          <w:color w:val="202124"/>
-        </w:rPr>
-        <w:t xml:space="preserve">    </w:t>
-      </w:r>
-      <w:r>
-        <w:rPr>
-          <w:rStyle w:val="HTMLCode"/>
-          <w:color w:val="202124"/>
-        </w:rPr>
-        <w:t>│</w:t>
-      </w:r>
-      <w:r>
-        <w:rPr>
-          <w:rStyle w:val="HTMLCode"/>
-          <w:color w:val="202124"/>
-        </w:rPr>
-        <w:t xml:space="preserve">  Agent   </w:t>
-      </w:r>
-      <w:r>
-        <w:rPr>
-          <w:rStyle w:val="HTMLCode"/>
-          <w:color w:val="202124"/>
-        </w:rPr>
-        <w:t>│</w:t>
-      </w:r>
-      <w:r>
-        <w:rPr>
-          <w:rStyle w:val="HTMLCode"/>
-          <w:color w:val="202124"/>
-        </w:rPr>
-        <w:t xml:space="preserve">  </w:t>
-      </w:r>
-      <w:r>
-        <w:rPr>
-          <w:rStyle w:val="HTMLCode"/>
-          <w:color w:val="202124"/>
-        </w:rPr>
-        <w:t>│</w:t>
-      </w:r>
-      <w:r>
-        <w:rPr>
-          <w:rStyle w:val="HTMLCode"/>
-          <w:color w:val="202124"/>
-        </w:rPr>
-        <w:t xml:space="preserve">   Agent      </w:t>
-      </w:r>
-      <w:r>
-        <w:rPr>
-          <w:rStyle w:val="HTMLCode"/>
-          <w:color w:val="202124"/>
-        </w:rPr>
-        <w:t>│</w:t>
-      </w:r>
-      <w:r>
-        <w:rPr>
-          <w:rStyle w:val="HTMLCode"/>
-          <w:color w:val="202124"/>
-        </w:rPr>
-        <w:t xml:space="preserve">  </w:t>
-      </w:r>
-      <w:r>
-        <w:rPr>
-          <w:rStyle w:val="HTMLCode"/>
-          <w:color w:val="202124"/>
-        </w:rPr>
-        <w:t>│</w:t>
-      </w:r>
-      <w:r>
-        <w:rPr>
-          <w:rStyle w:val="HTMLCode"/>
-          <w:color w:val="202124"/>
-        </w:rPr>
-        <w:t xml:space="preserve">  Detection   </w:t>
-      </w:r>
-      <w:r>
-        <w:rPr>
-          <w:rStyle w:val="HTMLCode"/>
-          <w:color w:val="202124"/>
-        </w:rPr>
-        <w:t>│</w:t>
-      </w:r>
-      <w:r>
-        <w:rPr>
-          <w:rStyle w:val="HTMLCode"/>
-          <w:color w:val="202124"/>
-        </w:rPr>
-        <w:t xml:space="preserve">  </w:t>
-      </w:r>
-      <w:r>
-        <w:rPr>
-          <w:rStyle w:val="HTMLCode"/>
-          <w:color w:val="202124"/>
-        </w:rPr>
-        <w:t>│</w:t>
-      </w:r>
-      <w:r>
-        <w:rPr>
-          <w:rStyle w:val="HTMLCode"/>
-          <w:color w:val="202124"/>
-        </w:rPr>
-        <w:t xml:space="preserve">  Agent   </w:t>
-      </w:r>
-      <w:r>
-        <w:rPr>
-          <w:rStyle w:val="HTMLCode"/>
-          <w:color w:val="202124"/>
-        </w:rPr>
-        <w:t>│</w:t>
-      </w:r>
-      <w:r>
-        <w:rPr>
-          <w:rStyle w:val="HTMLCode"/>
-          <w:color w:val="202124"/>
-        </w:rPr>
-        <w:t xml:space="preserve">        </w:t>
-      </w:r>
-      <w:r>
-        <w:rPr>
-          <w:rStyle w:val="HTMLCode"/>
-          <w:color w:val="202124"/>
-        </w:rPr>
-        <w:t>│</w:t>
-      </w:r>
-    </w:p>
-    <w:p>
-      <w:pPr>
-        <w:pStyle w:val="HTMLPreformatted"/>
-        <w:rPr>
-          <w:rStyle w:val="HTMLCode"/>
-          <w:color w:val="202124"/>
-        </w:rPr>
-      </w:pPr>
-      <w:r>
-        <w:rPr>
-          <w:rStyle w:val="HTMLCode"/>
-          <w:color w:val="202124"/>
-        </w:rPr>
-        <w:t>│    └──────────┘  └──────────────┘  └──────────────┘  └──────────┘        │</w:t>
-      </w:r>
-    </w:p>
-    <w:p>
-      <w:pPr>
-        <w:pStyle w:val="HTMLPreformatted"/>
-        <w:rPr>
-          <w:rStyle w:val="HTMLCode"/>
-          <w:color w:val="202124"/>
-        </w:rPr>
-      </w:pPr>
-      <w:r>
-        <w:rPr>
-          <w:rStyle w:val="HTMLCode"/>
-          <w:color w:val="202124"/>
-        </w:rPr>
-        <w:t>└──────┬──────────────────────────────────────────────────┬────────────────┘</w:t>
-      </w:r>
-    </w:p>
-    <w:p>
-      <w:pPr>
-        <w:pStyle w:val="HTMLPreformatted"/>
-        <w:rPr>
-          <w:rStyle w:val="HTMLCode"/>
-          <w:color w:val="202124"/>
-        </w:rPr>
-      </w:pPr>
-      <w:r>
-        <w:rPr>
-          <w:rStyle w:val="HTMLCode"/>
-          <w:color w:val="202124"/>
-        </w:rPr>
-        <w:t xml:space="preserve">       </w:t>
-      </w:r>
-      <w:r>
-        <w:rPr>
-          <w:rStyle w:val="HTMLCode"/>
-          <w:color w:val="202124"/>
-        </w:rPr>
-        <w:t>│</w:t>
-      </w:r>
-      <w:r>
-        <w:rPr>
-          <w:rStyle w:val="HTMLCode"/>
-          <w:color w:val="202124"/>
-        </w:rPr>
-        <w:t xml:space="preserve">                                                  </w:t>
-      </w:r>
-      <w:r>
-        <w:rPr>
-          <w:rStyle w:val="HTMLCode"/>
-          <w:color w:val="202124"/>
-        </w:rPr>
-        <w:t>│</w:t>
-      </w:r>
-    </w:p>
-    <w:p>
-      <w:pPr>
-        <w:pStyle w:val="HTMLPreformatted"/>
-        <w:rPr>
-          <w:rStyle w:val="HTMLCode"/>
-          <w:color w:val="202124"/>
-        </w:rPr>
-      </w:pPr>
-      <w:r>
-        <w:rPr>
-          <w:rStyle w:val="HTMLCode"/>
-          <w:color w:val="202124"/>
-        </w:rPr>
-        <w:t xml:space="preserve">       ▼                                                  ▼</w:t>
-      </w:r>
-    </w:p>
-    <w:p>
-      <w:pPr>
-        <w:pStyle w:val="HTMLPreformatted"/>
-        <w:rPr>
-          <w:rStyle w:val="HTMLCode"/>
-          <w:color w:val="202124"/>
-        </w:rPr>
-      </w:pPr>
-      <w:r>
-        <w:rPr>
-          <w:rStyle w:val="HTMLCode"/>
-          <w:color w:val="202124"/>
-        </w:rPr>
-        <w:t>┌─────────────────┐  ┌────────────────┐  ┌──────────────────────────────┐</w:t>
-      </w:r>
-    </w:p>
-    <w:p>
-      <w:pPr>
-        <w:pStyle w:val="HTMLPreformatted"/>
-        <w:rPr>
-          <w:rStyle w:val="HTMLCode"/>
-          <w:color w:val="202124"/>
-        </w:rPr>
-      </w:pPr>
-      <w:r>
-        <w:rPr>
-          <w:rStyle w:val="HTMLCode"/>
-          <w:color w:val="202124"/>
-        </w:rPr>
-        <w:t>│</w:t>
-      </w:r>
-      <w:r>
-        <w:rPr>
-          <w:rStyle w:val="HTMLCode"/>
-          <w:color w:val="202124"/>
-        </w:rPr>
-        <w:t xml:space="preserve">  Cloud Storage  </w:t>
-      </w:r>
-      <w:r>
-        <w:rPr>
-          <w:rStyle w:val="HTMLCode"/>
-          <w:color w:val="202124"/>
-        </w:rPr>
-        <w:t>│</w:t>
-      </w:r>
-      <w:r>
-        <w:rPr>
-          <w:rStyle w:val="HTMLCode"/>
-          <w:color w:val="202124"/>
-        </w:rPr>
-        <w:t xml:space="preserve">  </w:t>
-      </w:r>
-      <w:r>
-        <w:rPr>
-          <w:rStyle w:val="HTMLCode"/>
-          <w:color w:val="202124"/>
-        </w:rPr>
-        <w:t>│</w:t>
-      </w:r>
-      <w:r>
-        <w:rPr>
-          <w:rStyle w:val="HTMLCode"/>
-          <w:color w:val="202124"/>
-        </w:rPr>
-        <w:t xml:space="preserve">  Firestore     </w:t>
-      </w:r>
-      <w:r>
-        <w:rPr>
-          <w:rStyle w:val="HTMLCode"/>
-          <w:color w:val="202124"/>
-        </w:rPr>
-        <w:t>│</w:t>
-      </w:r>
-      <w:r>
-        <w:rPr>
-          <w:rStyle w:val="HTMLCode"/>
-          <w:color w:val="202124"/>
-        </w:rPr>
-        <w:t xml:space="preserve">  </w:t>
-      </w:r>
-      <w:r>
-        <w:rPr>
-          <w:rStyle w:val="HTMLCode"/>
-          <w:color w:val="202124"/>
-        </w:rPr>
-        <w:t>│</w:t>
-      </w:r>
-      <w:r>
-        <w:rPr>
-          <w:rStyle w:val="HTMLCode"/>
-          <w:color w:val="202124"/>
-        </w:rPr>
-        <w:t xml:space="preserve">  BigQuery                    </w:t>
-      </w:r>
-      <w:r>
-        <w:rPr>
-          <w:rStyle w:val="HTMLCode"/>
-          <w:color w:val="202124"/>
-        </w:rPr>
-        <w:t>│</w:t>
-      </w:r>
-    </w:p>
-    <w:p>
-      <w:pPr>
-        <w:pStyle w:val="HTMLPreformatted"/>
-        <w:rPr>
-          <w:rStyle w:val="HTMLCode"/>
-          <w:color w:val="202124"/>
-        </w:rPr>
-      </w:pPr>
-      <w:r>
-        <w:rPr>
-          <w:rStyle w:val="HTMLCode"/>
-          <w:color w:val="202124"/>
-        </w:rPr>
-        <w:t>│  (PDFs, signed  │  │  analyses,     │  │  fraud_patterns, agent_metrics│</w:t>
-      </w:r>
-    </w:p>
-    <w:p>
-      <w:pPr>
-        <w:pStyle w:val="HTMLPreformatted"/>
-        <w:rPr>
-          <w:rStyle w:val="HTMLCode"/>
-          <w:color w:val="202124"/>
-        </w:rPr>
-      </w:pPr>
-      <w:r>
-        <w:rPr>
-          <w:rStyle w:val="HTMLCode"/>
-          <w:color w:val="202124"/>
-        </w:rPr>
-        <w:t>│   URLs, TTL)    │  │  findings,     │  │  (cross-user analytics)      │</w:t>
-      </w:r>
-    </w:p>
-    <w:p>
-      <w:pPr>
-        <w:pStyle w:val="HTMLPreformatted"/>
-        <w:rPr>
-          <w:rStyle w:val="HTMLCode"/>
-          <w:color w:val="202124"/>
-        </w:rPr>
-      </w:pPr>
-      <w:r>
-        <w:rPr>
-          <w:rStyle w:val="HTMLCode"/>
-          <w:color w:val="202124"/>
-        </w:rPr>
-        <w:t>└─────────────────┘</w:t>
-      </w:r>
-      <w:r>
-        <w:rPr>
-          <w:rStyle w:val="HTMLCode"/>
-          <w:color w:val="202124"/>
-        </w:rPr>
-        <w:t xml:space="preserve">  </w:t>
-      </w:r>
-      <w:r>
-        <w:rPr>
-          <w:rStyle w:val="HTMLCode"/>
-          <w:color w:val="202124"/>
-        </w:rPr>
-        <w:t>│</w:t>
-      </w:r>
-      <w:r>
-        <w:rPr>
-          <w:rStyle w:val="HTMLCode"/>
-          <w:color w:val="202124"/>
-        </w:rPr>
-        <w:t xml:space="preserve">  audit log     </w:t>
-      </w:r>
-      <w:r>
-        <w:rPr>
-          <w:rStyle w:val="HTMLCode"/>
-          <w:color w:val="202124"/>
-        </w:rPr>
-        <w:t>│</w:t>
-      </w:r>
-      <w:r>
-        <w:rPr>
-          <w:rStyle w:val="HTMLCode"/>
-          <w:color w:val="202124"/>
-        </w:rPr>
-        <w:t xml:space="preserve">  </w:t>
-      </w:r>
-      <w:r>
-        <w:rPr>
-          <w:rStyle w:val="HTMLCode"/>
-          <w:color w:val="202124"/>
-        </w:rPr>
-        <w:t>└──────────────────────────────┘</w:t>
-      </w:r>
-    </w:p>
-    <w:p>
-      <w:pPr>
-        <w:pStyle w:val="HTMLPreformatted"/>
-        <w:rPr>
-          <w:rStyle w:val="HTMLCode"/>
-          <w:color w:val="202124"/>
-        </w:rPr>
-      </w:pPr>
-      <w:r>
-        <w:rPr>
-          <w:rStyle w:val="HTMLCode"/>
-          <w:color w:val="202124"/>
-        </w:rPr>
-        <w:t xml:space="preserve">                     </w:t>
-      </w:r>
-      <w:r>
-        <w:rPr>
-          <w:rStyle w:val="HTMLCode"/>
-          <w:color w:val="202124"/>
-        </w:rPr>
-        <w:t>└────────────────┘</w:t>
-      </w:r>
-    </w:p>
-    <w:p>
-      <w:pPr>
-        <w:pStyle w:val="HTMLPreformatted"/>
-        <w:rPr>
-          <w:rStyle w:val="HTMLCode"/>
-          <w:color w:val="202124"/>
-        </w:rPr>
-      </w:pPr>
-      <w:r>
-        <w:rPr>
-          <w:rStyle w:val="HTMLCode"/>
-          <w:color w:val="202124"/>
-        </w:rPr>
-        <w:t xml:space="preserve">                                   </w:t>
-      </w:r>
-      <w:r>
-        <w:rPr>
-          <w:rStyle w:val="HTMLCode"/>
-          <w:color w:val="202124"/>
-        </w:rPr>
-        <w:t>│</w:t>
-      </w:r>
-    </w:p>
-    <w:p>
-      <w:pPr>
-        <w:pStyle w:val="HTMLPreformatted"/>
-        <w:rPr>
-          <w:rStyle w:val="HTMLCode"/>
-          <w:color w:val="202124"/>
-        </w:rPr>
-      </w:pPr>
-      <w:r>
-        <w:rPr>
-          <w:rStyle w:val="HTMLCode"/>
-          <w:color w:val="202124"/>
-        </w:rPr>
-        <w:t>┌──────────────────────────────────────────────────────────────────────────┐</w:t>
-      </w:r>
-    </w:p>
-    <w:p>
-      <w:pPr>
-        <w:pStyle w:val="HTMLPreformatted"/>
-        <w:rPr>
-          <w:rStyle w:val="HTMLCode"/>
-          <w:color w:val="202124"/>
-        </w:rPr>
-      </w:pPr>
-      <w:r>
-        <w:rPr>
-          <w:rStyle w:val="HTMLCode"/>
-          <w:color w:val="202124"/>
-        </w:rPr>
-        <w:t>│  CROSS-CUTTING                                                           │</w:t>
-      </w:r>
-    </w:p>
-    <w:p>
-      <w:pPr>
-        <w:pStyle w:val="HTMLPreformatted"/>
-        <w:rPr>
-          <w:rStyle w:val="HTMLCode"/>
-          <w:color w:val="202124"/>
-        </w:rPr>
-      </w:pPr>
-      <w:r>
-        <w:rPr>
-          <w:rStyle w:val="HTMLCode"/>
-          <w:color w:val="202124"/>
-        </w:rPr>
-        <w:t>│  Cloud Logging · Cloud Monitoring · Secret Manager · IAM                 │</w:t>
-      </w:r>
-    </w:p>
-    <w:p>
-      <w:pPr>
-        <w:pStyle w:val="HTMLPreformatted"/>
-        <w:rPr>
-          <w:rStyle w:val="HTMLCode"/>
-          <w:color w:val="202124"/>
-        </w:rPr>
-      </w:pPr>
-      <w:r>
-        <w:rPr>
-          <w:rStyle w:val="HTMLCode"/>
-          <w:color w:val="202124"/>
-        </w:rPr>
-        <w:t>│  Artifact Registry · Cloud Build (CI/CD)                                 │</w:t>
-      </w:r>
-    </w:p>
-    <w:p>
-      <w:pPr>
-        <w:pStyle w:val="HTMLPreformatted"/>
-        <w:rPr>
-          <w:color w:val="202124"/>
-        </w:rPr>
-      </w:pPr>
-      <w:r>
-        <w:rPr>
-          <w:rStyle w:val="HTMLCode"/>
-          <w:color w:val="202124"/>
-        </w:rPr>
-        <w:t>└──────────────────────────────────────────────────────────────────────────┘</w:t>
+        <w:pStyle w:val="NormalWeb"/>
+        <w:rPr>
+          <w:rFonts w:ascii="Calibri" w:hAnsi="Calibri" w:cs="Calibri"/>
+          <w:color w:val="202124"/>
+          <w:sz w:val="22"/>
+          <w:szCs w:val="22"/>
+        </w:rPr>
+      </w:pPr>
+      <w:r>
+        <w:rPr>
+          <w:rFonts w:ascii="Calibri" w:hAnsi="Calibri" w:cs="Calibri"/>
+          <w:noProof/>
+          <w:color w:val="202124"/>
+          <w:sz w:val="22"/>
+          <w:szCs w:val="22"/>
+        </w:rPr>
+        <w:lastRenderedPageBreak/>
+        <w:drawing>
+          <wp:inline distT="0" distB="0" distL="0" distR="0" wp14:anchorId="031D8412" wp14:editId="1E606AA7">
+            <wp:extent cx="12192627" cy="6858352"/>
+            <wp:effectExtent l="0" t="0" r="0" b="0"/>
+            <wp:docPr id="7" name="Picture 7" descr="Architecture diagram"/>
+            <wp:cNvGraphicFramePr>
+              <a:graphicFrameLocks xmlns:a="http://schemas.openxmlformats.org/drawingml/2006/main" noChangeAspect="1"/>
+            </wp:cNvGraphicFramePr>
+            <a:graphic xmlns:a="http://schemas.openxmlformats.org/drawingml/2006/main">
+              <a:graphicData uri="http://schemas.openxmlformats.org/drawingml/2006/picture">
+                <pic:pic xmlns:pic="http://schemas.openxmlformats.org/drawingml/2006/picture">
+                  <pic:nvPicPr>
+                    <pic:cNvPr id="0" name="Picture 7" descr="Architecture diagram"/>
+                    <pic:cNvPicPr>
+                      <a:picLocks noChangeAspect="1" noChangeArrowheads="1"/>
+                    </pic:cNvPicPr>
+                  </pic:nvPicPr>
+                  <pic:blipFill>
+                    <a:blip r:link="rId6">
+                      <a:extLst>
+                        <a:ext uri="{28A0092B-C50C-407E-A947-70E740481C1C}">
+                          <a14:useLocalDpi xmlns:a14="http://schemas.microsoft.com/office/drawing/2010/main" val="0"/>
+                        </a:ext>
+                      </a:extLst>
+                    </a:blip>
+                    <a:srcRect/>
+                    <a:stretch>
+                      <a:fillRect/>
+                    </a:stretch>
+                  </pic:blipFill>
+                  <pic:spPr bwMode="auto">
+                    <a:xfrm>
+                      <a:off x="0" y="0"/>
+                      <a:ext cx="12192627" cy="6858352"/>
+                    </a:xfrm>
+                    <a:prstGeom prst="rect">
+                      <a:avLst/>
+                    </a:prstGeom>
+                    <a:noFill/>
+                    <a:ln>
+                      <a:noFill/>
+                    </a:ln>
+                  </pic:spPr>
+                </pic:pic>
+              </a:graphicData>
+            </a:graphic>
+          </wp:inline>
+        </w:drawing>
       </w:r>
     </w:p>
     <w:p>
@@ -4159,6 +1933,7 @@
                 <w:sz w:val="21"/>
                 <w:szCs w:val="21"/>
               </w:rPr>
+              <w:lastRenderedPageBreak/>
               <w:t>GCP Service</w:t>
             </w:r>
           </w:p>
@@ -5221,8 +2996,8 @@
           <w:sz w:val="22"/>
           <w:szCs w:val="22"/>
         </w:rPr>
-        <w:pict w14:anchorId="0B90E8E0">
-          <v:rect id="_x0000_i1030" style="width:0;height:1.5pt" o:hralign="center" o:hrstd="t" o:hr="t" fillcolor="#a0a0a0" stroked="f"/>
+        <w:pict w14:anchorId="73E8406A">
+          <v:rect id="_x0000_i1032" style="width:0;height:1.5pt" o:hralign="center" o:hrstd="t" o:hr="t" fillcolor="#a0a0a0" stroked="f"/>
         </w:pict>
       </w:r>
     </w:p>
@@ -5237,6 +3012,7 @@
         <w:rPr>
           <w:rFonts w:eastAsia="Times New Roman"/>
         </w:rPr>
+        <w:lastRenderedPageBreak/>
         <w:t>Section 6: Key Tasks, Workflows &amp; Capabilities</w:t>
       </w:r>
     </w:p>
@@ -5321,16 +3097,7 @@
           <w:sz w:val="22"/>
           <w:szCs w:val="22"/>
         </w:rPr>
-        <w:t xml:space="preserve"> </w:t>
-      </w:r>
-      <w:r>
-        <w:rPr>
-          <w:rFonts w:ascii="Calibri" w:eastAsia="Times New Roman" w:hAnsi="Calibri" w:cs="Calibri"/>
-          <w:color w:val="202124"/>
-          <w:sz w:val="22"/>
-          <w:szCs w:val="22"/>
-        </w:rPr>
-        <w:t>— read PDFs directly with Gemini (no separate OCR stage); extract a strict JSON schema.</w:t>
+        <w:t xml:space="preserve"> — read PDFs directly with Gemini (no separate OCR stage); extract a strict JSON schema.</w:t>
       </w:r>
     </w:p>
     <w:p>
@@ -5365,7 +3132,16 @@
           <w:sz w:val="22"/>
           <w:szCs w:val="22"/>
         </w:rPr>
-        <w:t xml:space="preserve"> — match party names across documents tolerant of transliteration variants (Hindi/Urdu/regional script).</w:t>
+        <w:t xml:space="preserve"> </w:t>
+      </w:r>
+      <w:r>
+        <w:rPr>
+          <w:rFonts w:ascii="Calibri" w:eastAsia="Times New Roman" w:hAnsi="Calibri" w:cs="Calibri"/>
+          <w:color w:val="202124"/>
+          <w:sz w:val="22"/>
+          <w:szCs w:val="22"/>
+        </w:rPr>
+        <w:t>— match party names across documents tolerant of transliteration variants (Hindi/Urdu/regional script).</w:t>
       </w:r>
     </w:p>
     <w:p>
@@ -5626,7 +3402,16 @@
           <w:sz w:val="22"/>
           <w:szCs w:val="22"/>
         </w:rPr>
-        <w:t xml:space="preserve"> — every finding linked back to source document + page; persisted for compliance.</w:t>
+        <w:t xml:space="preserve"> </w:t>
+      </w:r>
+      <w:r>
+        <w:rPr>
+          <w:rFonts w:ascii="Calibri" w:eastAsia="Times New Roman" w:hAnsi="Calibri" w:cs="Calibri"/>
+          <w:color w:val="202124"/>
+          <w:sz w:val="22"/>
+          <w:szCs w:val="22"/>
+        </w:rPr>
+        <w:t>— every finding linked back to source document + page; persisted for compliance.</w:t>
       </w:r>
     </w:p>
     <w:p>
@@ -6083,6 +3868,7 @@
                 <w:sz w:val="21"/>
                 <w:szCs w:val="21"/>
               </w:rPr>
+              <w:lastRenderedPageBreak/>
               <w:t>Validate against state land law</w:t>
             </w:r>
           </w:p>
@@ -6646,8 +4432,8 @@
           <w:sz w:val="22"/>
           <w:szCs w:val="22"/>
         </w:rPr>
-        <w:pict w14:anchorId="5142A175">
-          <v:rect id="_x0000_i1031" style="width:0;height:1.5pt" o:hralign="center" o:hrstd="t" o:hr="t" fillcolor="#a0a0a0" stroked="f"/>
+        <w:pict w14:anchorId="2FFC18BF">
+          <v:rect id="_x0000_i1033" style="width:0;height:1.5pt" o:hralign="center" o:hrstd="t" o:hr="t" fillcolor="#a0a0a0" stroked="f"/>
         </w:pict>
       </w:r>
     </w:p>
@@ -7021,6 +4807,7 @@
         <w:rPr>
           <w:rFonts w:eastAsia="Times New Roman"/>
         </w:rPr>
+        <w:lastRenderedPageBreak/>
         <w:t>Macro impact (India)</w:t>
       </w:r>
     </w:p>
@@ -7100,16 +4887,7 @@
           <w:sz w:val="22"/>
           <w:szCs w:val="22"/>
         </w:rPr>
-        <w:t xml:space="preserve"> </w:t>
-      </w:r>
-      <w:r>
-        <w:rPr>
-          <w:rFonts w:ascii="Calibri" w:eastAsia="Times New Roman" w:hAnsi="Calibri" w:cs="Calibri"/>
-          <w:color w:val="202124"/>
-          <w:sz w:val="22"/>
-          <w:szCs w:val="22"/>
-        </w:rPr>
-        <w:t>of civil litigation is land-related (Niti Aayog) — Landshield directly attacks the upstream cause.</w:t>
+        <w:t xml:space="preserve"> of civil litigation is land-related (Niti Aayog) — Landshield directly attacks the upstream cause.</w:t>
       </w:r>
     </w:p>
     <w:p>
@@ -7667,8 +5445,8 @@
           <w:sz w:val="22"/>
           <w:szCs w:val="22"/>
         </w:rPr>
-        <w:pict w14:anchorId="0438D54E">
-          <v:rect id="_x0000_i1032" style="width:0;height:1.5pt" o:hralign="center" o:hrstd="t" o:hr="t" fillcolor="#a0a0a0" stroked="f"/>
+        <w:pict w14:anchorId="754E2323">
+          <v:rect id="_x0000_i1034" style="width:0;height:1.5pt" o:hralign="center" o:hrstd="t" o:hr="t" fillcolor="#a0a0a0" stroked="f"/>
         </w:pict>
       </w:r>
     </w:p>
@@ -7732,7 +5510,16 @@
           <w:sz w:val="22"/>
           <w:szCs w:val="22"/>
         </w:rPr>
-        <w:t xml:space="preserve"> PDF bundle (1–15 documents per deal, typically 8); declared state, district, land type (agricultural / non-agricultural / tribal / residential / commercial).</w:t>
+        <w:t xml:space="preserve"> </w:t>
+      </w:r>
+      <w:r>
+        <w:rPr>
+          <w:rFonts w:ascii="Calibri" w:eastAsia="Times New Roman" w:hAnsi="Calibri" w:cs="Calibri"/>
+          <w:color w:val="202124"/>
+          <w:sz w:val="22"/>
+          <w:szCs w:val="22"/>
+        </w:rPr>
+        <w:t>PDF bundle (1–15 documents per deal, typically 8); declared state, district, land type (agricultural / non-agricultural / tribal / residential / commercial).</w:t>
       </w:r>
     </w:p>
     <w:p>
@@ -7767,16 +5554,7 @@
           <w:sz w:val="22"/>
           <w:szCs w:val="22"/>
         </w:rPr>
-        <w:t xml:space="preserve"> </w:t>
-      </w:r>
-      <w:r>
-        <w:rPr>
-          <w:rFonts w:ascii="Calibri" w:eastAsia="Times New Roman" w:hAnsi="Calibri" w:cs="Calibri"/>
-          <w:color w:val="202124"/>
-          <w:sz w:val="22"/>
-          <w:szCs w:val="22"/>
-        </w:rPr>
-        <w:t>sale deed, encumbrance certificate (EC), mutation extract, property tax receipt, building plan approval, RERA registration, khata / patta / 7-12 extract, parent documents (chain of title).</w:t>
+        <w:t xml:space="preserve"> sale deed, encumbrance certificate (EC), mutation extract, property tax receipt, building plan approval, RERA registration, khata / patta / 7-12 extract, parent documents (chain of title).</w:t>
       </w:r>
     </w:p>
     <w:p>
@@ -7972,7 +5750,15 @@
           <w:rStyle w:val="HTMLCode"/>
           <w:color w:val="202124"/>
         </w:rPr>
-        <w:t xml:space="preserve">    { "role": "seller", "name": "S. Ramesh",      "father_name": "Krishna" },</w:t>
+        <w:lastRenderedPageBreak/>
+        <w:t xml:space="preserve">    { "</w:t>
+      </w:r>
+      <w:r>
+        <w:rPr>
+          <w:rStyle w:val="HTMLCode"/>
+          <w:color w:val="202124"/>
+        </w:rPr>
+        <w:t>role": "seller", "name": "S. Ramesh",      "father_name": "Krishna" },</w:t>
       </w:r>
     </w:p>
     <w:p>
@@ -8241,14 +6027,14 @@
           <w:rStyle w:val="HTMLCode"/>
           <w:color w:val="202124"/>
         </w:rPr>
-        <w:t xml:space="preserve">     </w:t>
+        <w:t xml:space="preserve">      "summary": "</w:t>
       </w:r>
       <w:r>
         <w:rPr>
           <w:rStyle w:val="HTMLCode"/>
           <w:color w:val="202124"/>
         </w:rPr>
-        <w:t xml:space="preserve"> "summary": "Seller name on sale deed differs from EC (S. Ramesh vs Ramesh S.).",</w:t>
+        <w:t>Seller name on sale deed differs from EC (S. Ramesh vs Ramesh S.).",</w:t>
       </w:r>
     </w:p>
     <w:p>
@@ -8543,8 +6329,8 @@
           <w:sz w:val="22"/>
           <w:szCs w:val="22"/>
         </w:rPr>
-        <w:pict w14:anchorId="135BD5F9">
-          <v:rect id="_x0000_i1033" style="width:0;height:1.5pt" o:hralign="center" o:hrstd="t" o:hr="t" fillcolor="#a0a0a0" stroked="f"/>
+        <w:pict w14:anchorId="51A6E80E">
+          <v:rect id="_x0000_i1035" style="width:0;height:1.5pt" o:hralign="center" o:hrstd="t" o:hr="t" fillcolor="#a0a0a0" stroked="f"/>
         </w:pict>
       </w:r>
     </w:p>
@@ -8599,6 +6385,7 @@
           <w:sz w:val="22"/>
           <w:szCs w:val="22"/>
         </w:rPr>
+        <w:lastRenderedPageBreak/>
         <w:t>Strict JSON schema</w:t>
       </w:r>
       <w:r>
@@ -8764,7 +6551,16 @@
           <w:sz w:val="22"/>
           <w:szCs w:val="22"/>
         </w:rPr>
-        <w:t xml:space="preserve"> — rule packs per state prevent over-flagging (e.g., agricultural restrictions don't fire on urban deeds).</w:t>
+        <w:t xml:space="preserve"> </w:t>
+      </w:r>
+      <w:r>
+        <w:rPr>
+          <w:rFonts w:ascii="Calibri" w:eastAsia="Times New Roman" w:hAnsi="Calibri" w:cs="Calibri"/>
+          <w:color w:val="202124"/>
+          <w:sz w:val="22"/>
+          <w:szCs w:val="22"/>
+        </w:rPr>
+        <w:t>— rule packs per state prevent over-flagging (e.g., agricultural restrictions don't fire on urban deeds).</w:t>
       </w:r>
     </w:p>
     <w:p>
@@ -8799,16 +6595,7 @@
           <w:sz w:val="22"/>
           <w:szCs w:val="22"/>
         </w:rPr>
-        <w:t xml:space="preserve"> </w:t>
-      </w:r>
-      <w:r>
-        <w:rPr>
-          <w:rFonts w:ascii="Calibri" w:eastAsia="Times New Roman" w:hAnsi="Calibri" w:cs="Calibri"/>
-          <w:color w:val="202124"/>
-          <w:sz w:val="22"/>
-          <w:szCs w:val="22"/>
-        </w:rPr>
-        <w:t>— deterministic mapping from finding type → severity, not LLM-guessed.</w:t>
+        <w:t xml:space="preserve"> — deterministic mapping from finding type → severity, not LLM-guessed.</w:t>
       </w:r>
     </w:p>
     <w:p>
@@ -8894,16 +6681,7 @@
           <w:sz w:val="22"/>
           <w:szCs w:val="22"/>
         </w:rPr>
-        <w:t xml:space="preserve"> </w:t>
-      </w:r>
-      <w:r>
-        <w:rPr>
-          <w:rFonts w:ascii="Calibri" w:eastAsia="Times New Roman" w:hAnsi="Calibri" w:cs="Calibri"/>
-          <w:color w:val="202124"/>
-          <w:sz w:val="22"/>
-          <w:szCs w:val="22"/>
-        </w:rPr>
-        <w:t>— agents-run, latencies, costs, and inputs/outputs persisted for every analysis.</w:t>
+        <w:t xml:space="preserve"> — agents-run, latencies, costs, and inputs/outputs persisted for every analysis.</w:t>
       </w:r>
     </w:p>
     <w:p>
@@ -8991,7 +6769,7 @@
         </w:rPr>
         <w:t xml:space="preserve"> — golden test bundles (fraudulent + clean samples in </w:t>
       </w:r>
-      <w:hyperlink r:id="rId5" w:history="1">
+      <w:hyperlink r:id="rId7" w:history="1">
         <w:r>
           <w:rPr>
             <w:rStyle w:val="Hyperlink"/>
@@ -9637,6 +7415,7 @@
           <w:sz w:val="22"/>
           <w:szCs w:val="22"/>
         </w:rPr>
+        <w:lastRenderedPageBreak/>
         <w:t>Availability: 99.5 % monthly.</w:t>
       </w:r>
     </w:p>
@@ -9707,8 +7486,8 @@
           <w:sz w:val="22"/>
           <w:szCs w:val="22"/>
         </w:rPr>
-        <w:pict w14:anchorId="452C739E">
-          <v:rect id="_x0000_i1034" style="width:0;height:1.5pt" o:hralign="center" o:hrstd="t" o:hr="t" fillcolor="#a0a0a0" stroked="f"/>
+        <w:pict w14:anchorId="0B21421F">
+          <v:rect id="_x0000_i1036" style="width:0;height:1.5pt" o:hralign="center" o:hrstd="t" o:hr="t" fillcolor="#a0a0a0" stroked="f"/>
         </w:pict>
       </w:r>
     </w:p>
@@ -9729,8 +7508,7 @@
     <w:p>
       <w:pPr>
         <w:shd w:val="clear" w:color="auto" w:fill="F2F8FF"/>
-        <w:spacing w:before="200" w:after="200"/>
-        <w:divId w:val="976952475"/>
+        <w:divId w:val="1324775822"/>
         <w:rPr>
           <w:rFonts w:ascii="Calibri" w:eastAsia="Times New Roman" w:hAnsi="Calibri" w:cs="Calibri"/>
           <w:i/>
@@ -9766,9 +7544,9 @@
 <file path=word/numbering.xml><?xml version="1.0" encoding="utf-8"?>
 <w:numbering xmlns:wpc="http://schemas.microsoft.com/office/word/2010/wordprocessingCanvas" xmlns:cx="http://schemas.microsoft.com/office/drawing/2014/chartex" xmlns:cx1="http://schemas.microsoft.com/office/drawing/2015/9/8/chartex" xmlns:cx2="http://schemas.microsoft.com/office/drawing/2015/10/21/chartex" xmlns:cx3="http://schemas.microsoft.com/office/drawing/2016/5/9/chartex" xmlns:cx4="http://schemas.microsoft.com/office/drawing/2016/5/10/chartex" xmlns:cx5="http://schemas.microsoft.com/office/drawing/2016/5/11/chartex" xmlns:cx6="http://schemas.microsoft.com/office/drawing/2016/5/12/chartex" xmlns:cx7="http://schemas.microsoft.com/office/drawing/2016/5/13/chartex" xmlns:cx8="http://schemas.microsoft.com/office/drawing/2016/5/14/chartex" xmlns:mc="http://schemas.openxmlformats.org/markup-compatibility/2006" xmlns:aink="http://schemas.microsoft.com/office/drawing/2016/ink" xmlns:am3d="http://schemas.microsoft.com/office/drawing/2017/model3d" xmlns:o="urn:schemas-microsoft-com:office:office" xmlns:oel="http://schemas.microsoft.com/office/2019/extlst" xmlns:r="http://schemas.openxmlformats.org/officeDocument/2006/relationships" xmlns:m="http://schemas.openxmlformats.org/officeDocument/2006/math" xmlns:v="urn:schemas-microsoft-com:vml" xmlns:wp14="http://schemas.microsoft.com/office/word/2010/wordprocessingDrawing" xmlns:wp="http://schemas.openxmlformats.org/drawingml/2006/wordprocessingDrawing" xmlns:w10="urn:schemas-microsoft-com:office:word" xmlns:w="http://schemas.openxmlformats.org/wordprocessingml/2006/main" xmlns:w14="http://schemas.microsoft.com/office/word/2010/wordml" xmlns:w15="http://schemas.microsoft.com/office/word/2012/wordml" xmlns:w16cex="http://schemas.microsoft.com/office/word/2018/wordml/cex" xmlns:w16cid="http://schemas.microsoft.com/office/word/2016/wordml/cid" xmlns:w16="http://schemas.microsoft.com/office/word/2018/wordml" xmlns:w16du="http://schemas.microsoft.com/office/word/2023/wordml/word16du" xmlns:w16sdtdh="http://schemas.microsoft.com/office/word/2020/wordml/sdtdatahash" xmlns:w16sdtfl="http://schemas.microsoft.com/office/word/2024/wordml/sdtformatlock" xmlns:w16se="http://schemas.microsoft.com/office/word/2015/wordml/symex" xmlns:wpg="http://schemas.microsoft.com/office/word/2010/wordprocessingGroup" xmlns:wpi="http://schemas.microsoft.com/office/word/2010/wordprocessingInk" xmlns:wne="http://schemas.microsoft.com/office/word/2006/wordml" xmlns:wps="http://schemas.microsoft.com/office/word/2010/wordprocessingShape" mc:Ignorable="w14 w15 w16se w16cid w16 w16cex w16sdtdh w16sdtfl w16du wp14">
   <w:abstractNum w:abstractNumId="0" w15:restartNumberingAfterBreak="0">
-    <w:nsid w:val="048D49BF"/>
+    <w:nsid w:val="24405394"/>
     <w:multiLevelType w:val="multilevel"/>
-    <w:tmpl w:val="ADB482C4"/>
+    <w:tmpl w:val="2A4067AA"/>
     <w:lvl w:ilvl="0">
       <w:start w:val="1"/>
       <w:numFmt w:val="bullet"/>
@@ -9915,9 +7693,9 @@
     </w:lvl>
   </w:abstractNum>
   <w:abstractNum w:abstractNumId="1" w15:restartNumberingAfterBreak="0">
-    <w:nsid w:val="1D242A10"/>
+    <w:nsid w:val="33A16067"/>
     <w:multiLevelType w:val="multilevel"/>
-    <w:tmpl w:val="B3A65420"/>
+    <w:tmpl w:val="5204E1A8"/>
     <w:lvl w:ilvl="0">
       <w:start w:val="1"/>
       <w:numFmt w:val="decimal"/>
@@ -10028,9 +7806,9 @@
     </w:lvl>
   </w:abstractNum>
   <w:abstractNum w:abstractNumId="2" w15:restartNumberingAfterBreak="0">
-    <w:nsid w:val="223C0753"/>
+    <w:nsid w:val="3E1325FE"/>
     <w:multiLevelType w:val="multilevel"/>
-    <w:tmpl w:val="68389076"/>
+    <w:tmpl w:val="53B000CE"/>
     <w:lvl w:ilvl="0">
       <w:start w:val="1"/>
       <w:numFmt w:val="bullet"/>
@@ -10177,9 +7955,9 @@
     </w:lvl>
   </w:abstractNum>
   <w:abstractNum w:abstractNumId="3" w15:restartNumberingAfterBreak="0">
-    <w:nsid w:val="32B62D9B"/>
+    <w:nsid w:val="49657958"/>
     <w:multiLevelType w:val="multilevel"/>
-    <w:tmpl w:val="9D9C01D8"/>
+    <w:tmpl w:val="E4B46DCC"/>
     <w:lvl w:ilvl="0">
       <w:start w:val="1"/>
       <w:numFmt w:val="decimal"/>
@@ -10290,9 +8068,9 @@
     </w:lvl>
   </w:abstractNum>
   <w:abstractNum w:abstractNumId="4" w15:restartNumberingAfterBreak="0">
-    <w:nsid w:val="337000D3"/>
+    <w:nsid w:val="4B5E119B"/>
     <w:multiLevelType w:val="multilevel"/>
-    <w:tmpl w:val="9F60B012"/>
+    <w:tmpl w:val="360A9072"/>
     <w:lvl w:ilvl="0">
       <w:start w:val="1"/>
       <w:numFmt w:val="bullet"/>
@@ -10439,9 +8217,122 @@
     </w:lvl>
   </w:abstractNum>
   <w:abstractNum w:abstractNumId="5" w15:restartNumberingAfterBreak="0">
-    <w:nsid w:val="34637223"/>
+    <w:nsid w:val="4EA133B6"/>
     <w:multiLevelType w:val="multilevel"/>
-    <w:tmpl w:val="F49EF9B4"/>
+    <w:tmpl w:val="394C99EE"/>
+    <w:lvl w:ilvl="0">
+      <w:start w:val="1"/>
+      <w:numFmt w:val="decimal"/>
+      <w:lvlText w:val="%1."/>
+      <w:lvlJc w:val="left"/>
+      <w:pPr>
+        <w:tabs>
+          <w:tab w:val="num" w:pos="720"/>
+        </w:tabs>
+        <w:ind w:left="720" w:hanging="360"/>
+      </w:pPr>
+    </w:lvl>
+    <w:lvl w:ilvl="1" w:tentative="1">
+      <w:start w:val="1"/>
+      <w:numFmt w:val="decimal"/>
+      <w:lvlText w:val="%2."/>
+      <w:lvlJc w:val="left"/>
+      <w:pPr>
+        <w:tabs>
+          <w:tab w:val="num" w:pos="1440"/>
+        </w:tabs>
+        <w:ind w:left="1440" w:hanging="360"/>
+      </w:pPr>
+    </w:lvl>
+    <w:lvl w:ilvl="2" w:tentative="1">
+      <w:start w:val="1"/>
+      <w:numFmt w:val="decimal"/>
+      <w:lvlText w:val="%3."/>
+      <w:lvlJc w:val="left"/>
+      <w:pPr>
+        <w:tabs>
+          <w:tab w:val="num" w:pos="2160"/>
+        </w:tabs>
+        <w:ind w:left="2160" w:hanging="360"/>
+      </w:pPr>
+    </w:lvl>
+    <w:lvl w:ilvl="3" w:tentative="1">
+      <w:start w:val="1"/>
+      <w:numFmt w:val="decimal"/>
+      <w:lvlText w:val="%4."/>
+      <w:lvlJc w:val="left"/>
+      <w:pPr>
+        <w:tabs>
+          <w:tab w:val="num" w:pos="2880"/>
+        </w:tabs>
+        <w:ind w:left="2880" w:hanging="360"/>
+      </w:pPr>
+    </w:lvl>
+    <w:lvl w:ilvl="4" w:tentative="1">
+      <w:start w:val="1"/>
+      <w:numFmt w:val="decimal"/>
+      <w:lvlText w:val="%5."/>
+      <w:lvlJc w:val="left"/>
+      <w:pPr>
+        <w:tabs>
+          <w:tab w:val="num" w:pos="3600"/>
+        </w:tabs>
+        <w:ind w:left="3600" w:hanging="360"/>
+      </w:pPr>
+    </w:lvl>
+    <w:lvl w:ilvl="5" w:tentative="1">
+      <w:start w:val="1"/>
+      <w:numFmt w:val="decimal"/>
+      <w:lvlText w:val="%6."/>
+      <w:lvlJc w:val="left"/>
+      <w:pPr>
+        <w:tabs>
+          <w:tab w:val="num" w:pos="4320"/>
+        </w:tabs>
+        <w:ind w:left="4320" w:hanging="360"/>
+      </w:pPr>
+    </w:lvl>
+    <w:lvl w:ilvl="6" w:tentative="1">
+      <w:start w:val="1"/>
+      <w:numFmt w:val="decimal"/>
+      <w:lvlText w:val="%7."/>
+      <w:lvlJc w:val="left"/>
+      <w:pPr>
+        <w:tabs>
+          <w:tab w:val="num" w:pos="5040"/>
+        </w:tabs>
+        <w:ind w:left="5040" w:hanging="360"/>
+      </w:pPr>
+    </w:lvl>
+    <w:lvl w:ilvl="7" w:tentative="1">
+      <w:start w:val="1"/>
+      <w:numFmt w:val="decimal"/>
+      <w:lvlText w:val="%8."/>
+      <w:lvlJc w:val="left"/>
+      <w:pPr>
+        <w:tabs>
+          <w:tab w:val="num" w:pos="5760"/>
+        </w:tabs>
+        <w:ind w:left="5760" w:hanging="360"/>
+      </w:pPr>
+    </w:lvl>
+    <w:lvl w:ilvl="8" w:tentative="1">
+      <w:start w:val="1"/>
+      <w:numFmt w:val="decimal"/>
+      <w:lvlText w:val="%9."/>
+      <w:lvlJc w:val="left"/>
+      <w:pPr>
+        <w:tabs>
+          <w:tab w:val="num" w:pos="6480"/>
+        </w:tabs>
+        <w:ind w:left="6480" w:hanging="360"/>
+      </w:pPr>
+    </w:lvl>
+  </w:abstractNum>
+  <w:abstractNum w:abstractNumId="6" w15:restartNumberingAfterBreak="0">
+    <w:nsid w:val="4F780582"/>
+    <w:multiLevelType w:val="multilevel"/>
+    <w:tmpl w:val="E996E58A"/>
     <w:lvl w:ilvl="0">
       <w:start w:val="1"/>
       <w:numFmt w:val="bullet"/>
@@ -10587,10 +8478,10 @@
       </w:rPr>
     </w:lvl>
   </w:abstractNum>
-  <w:abstractNum w:abstractNumId="6" w15:restartNumberingAfterBreak="0">
-    <w:nsid w:val="3E8C3AE1"/>
+  <w:abstractNum w:abstractNumId="7" w15:restartNumberingAfterBreak="0">
+    <w:nsid w:val="53117C72"/>
     <w:multiLevelType w:val="multilevel"/>
-    <w:tmpl w:val="03FC527A"/>
+    <w:tmpl w:val="E6CA5942"/>
     <w:lvl w:ilvl="0">
       <w:start w:val="1"/>
       <w:numFmt w:val="bullet"/>
@@ -10736,10 +8627,10 @@
       </w:rPr>
     </w:lvl>
   </w:abstractNum>
-  <w:abstractNum w:abstractNumId="7" w15:restartNumberingAfterBreak="0">
-    <w:nsid w:val="4BC16FED"/>
+  <w:abstractNum w:abstractNumId="8" w15:restartNumberingAfterBreak="0">
+    <w:nsid w:val="606853F7"/>
     <w:multiLevelType w:val="multilevel"/>
-    <w:tmpl w:val="65A03E40"/>
+    <w:tmpl w:val="EA742BD2"/>
     <w:lvl w:ilvl="0">
       <w:start w:val="1"/>
       <w:numFmt w:val="bullet"/>
@@ -10885,10 +8776,123 @@
       </w:rPr>
     </w:lvl>
   </w:abstractNum>
-  <w:abstractNum w:abstractNumId="8" w15:restartNumberingAfterBreak="0">
-    <w:nsid w:val="68055A96"/>
+  <w:abstractNum w:abstractNumId="9" w15:restartNumberingAfterBreak="0">
+    <w:nsid w:val="61AF547C"/>
     <w:multiLevelType w:val="multilevel"/>
-    <w:tmpl w:val="D37CED0A"/>
+    <w:tmpl w:val="C9568B06"/>
+    <w:lvl w:ilvl="0">
+      <w:start w:val="1"/>
+      <w:numFmt w:val="decimal"/>
+      <w:lvlText w:val="%1."/>
+      <w:lvlJc w:val="left"/>
+      <w:pPr>
+        <w:tabs>
+          <w:tab w:val="num" w:pos="720"/>
+        </w:tabs>
+        <w:ind w:left="720" w:hanging="360"/>
+      </w:pPr>
+    </w:lvl>
+    <w:lvl w:ilvl="1" w:tentative="1">
+      <w:start w:val="1"/>
+      <w:numFmt w:val="decimal"/>
+      <w:lvlText w:val="%2."/>
+      <w:lvlJc w:val="left"/>
+      <w:pPr>
+        <w:tabs>
+          <w:tab w:val="num" w:pos="1440"/>
+        </w:tabs>
+        <w:ind w:left="1440" w:hanging="360"/>
+      </w:pPr>
+    </w:lvl>
+    <w:lvl w:ilvl="2" w:tentative="1">
+      <w:start w:val="1"/>
+      <w:numFmt w:val="decimal"/>
+      <w:lvlText w:val="%3."/>
+      <w:lvlJc w:val="left"/>
+      <w:pPr>
+        <w:tabs>
+          <w:tab w:val="num" w:pos="2160"/>
+        </w:tabs>
+        <w:ind w:left="2160" w:hanging="360"/>
+      </w:pPr>
+    </w:lvl>
+    <w:lvl w:ilvl="3" w:tentative="1">
+      <w:start w:val="1"/>
+      <w:numFmt w:val="decimal"/>
+      <w:lvlText w:val="%4."/>
+      <w:lvlJc w:val="left"/>
+      <w:pPr>
+        <w:tabs>
+          <w:tab w:val="num" w:pos="2880"/>
+        </w:tabs>
+        <w:ind w:left="2880" w:hanging="360"/>
+      </w:pPr>
+    </w:lvl>
+    <w:lvl w:ilvl="4" w:tentative="1">
+      <w:start w:val="1"/>
+      <w:numFmt w:val="decimal"/>
+      <w:lvlText w:val="%5."/>
+      <w:lvlJc w:val="left"/>
+      <w:pPr>
+        <w:tabs>
+          <w:tab w:val="num" w:pos="3600"/>
+        </w:tabs>
+        <w:ind w:left="3600" w:hanging="360"/>
+      </w:pPr>
+    </w:lvl>
+    <w:lvl w:ilvl="5" w:tentative="1">
+      <w:start w:val="1"/>
+      <w:numFmt w:val="decimal"/>
+      <w:lvlText w:val="%6."/>
+      <w:lvlJc w:val="left"/>
+      <w:pPr>
+        <w:tabs>
+          <w:tab w:val="num" w:pos="4320"/>
+        </w:tabs>
+        <w:ind w:left="4320" w:hanging="360"/>
+      </w:pPr>
+    </w:lvl>
+    <w:lvl w:ilvl="6" w:tentative="1">
+      <w:start w:val="1"/>
+      <w:numFmt w:val="decimal"/>
+      <w:lvlText w:val="%7."/>
+      <w:lvlJc w:val="left"/>
+      <w:pPr>
+        <w:tabs>
+          <w:tab w:val="num" w:pos="5040"/>
+        </w:tabs>
+        <w:ind w:left="5040" w:hanging="360"/>
+      </w:pPr>
+    </w:lvl>
+    <w:lvl w:ilvl="7" w:tentative="1">
+      <w:start w:val="1"/>
+      <w:numFmt w:val="decimal"/>
+      <w:lvlText w:val="%8."/>
+      <w:lvlJc w:val="left"/>
+      <w:pPr>
+        <w:tabs>
+          <w:tab w:val="num" w:pos="5760"/>
+        </w:tabs>
+        <w:ind w:left="5760" w:hanging="360"/>
+      </w:pPr>
+    </w:lvl>
+    <w:lvl w:ilvl="8" w:tentative="1">
+      <w:start w:val="1"/>
+      <w:numFmt w:val="decimal"/>
+      <w:lvlText w:val="%9."/>
+      <w:lvlJc w:val="left"/>
+      <w:pPr>
+        <w:tabs>
+          <w:tab w:val="num" w:pos="6480"/>
+        </w:tabs>
+        <w:ind w:left="6480" w:hanging="360"/>
+      </w:pPr>
+    </w:lvl>
+  </w:abstractNum>
+  <w:abstractNum w:abstractNumId="10" w15:restartNumberingAfterBreak="0">
+    <w:nsid w:val="765270A1"/>
+    <w:multiLevelType w:val="multilevel"/>
+    <w:tmpl w:val="5A4C88A2"/>
     <w:lvl w:ilvl="0">
       <w:start w:val="1"/>
       <w:numFmt w:val="bullet"/>
@@ -11034,123 +9038,10 @@
       </w:rPr>
     </w:lvl>
   </w:abstractNum>
-  <w:abstractNum w:abstractNumId="9" w15:restartNumberingAfterBreak="0">
-    <w:nsid w:val="742805D3"/>
+  <w:abstractNum w:abstractNumId="11" w15:restartNumberingAfterBreak="0">
+    <w:nsid w:val="77C64B53"/>
     <w:multiLevelType w:val="multilevel"/>
-    <w:tmpl w:val="5504FD3A"/>
-    <w:lvl w:ilvl="0">
-      <w:start w:val="1"/>
-      <w:numFmt w:val="decimal"/>
-      <w:lvlText w:val="%1."/>
-      <w:lvlJc w:val="left"/>
-      <w:pPr>
-        <w:tabs>
-          <w:tab w:val="num" w:pos="720"/>
-        </w:tabs>
-        <w:ind w:left="720" w:hanging="360"/>
-      </w:pPr>
-    </w:lvl>
-    <w:lvl w:ilvl="1" w:tentative="1">
-      <w:start w:val="1"/>
-      <w:numFmt w:val="decimal"/>
-      <w:lvlText w:val="%2."/>
-      <w:lvlJc w:val="left"/>
-      <w:pPr>
-        <w:tabs>
-          <w:tab w:val="num" w:pos="1440"/>
-        </w:tabs>
-        <w:ind w:left="1440" w:hanging="360"/>
-      </w:pPr>
-    </w:lvl>
-    <w:lvl w:ilvl="2" w:tentative="1">
-      <w:start w:val="1"/>
-      <w:numFmt w:val="decimal"/>
-      <w:lvlText w:val="%3."/>
-      <w:lvlJc w:val="left"/>
-      <w:pPr>
-        <w:tabs>
-          <w:tab w:val="num" w:pos="2160"/>
-        </w:tabs>
-        <w:ind w:left="2160" w:hanging="360"/>
-      </w:pPr>
-    </w:lvl>
-    <w:lvl w:ilvl="3" w:tentative="1">
-      <w:start w:val="1"/>
-      <w:numFmt w:val="decimal"/>
-      <w:lvlText w:val="%4."/>
-      <w:lvlJc w:val="left"/>
-      <w:pPr>
-        <w:tabs>
-          <w:tab w:val="num" w:pos="2880"/>
-        </w:tabs>
-        <w:ind w:left="2880" w:hanging="360"/>
-      </w:pPr>
-    </w:lvl>
-    <w:lvl w:ilvl="4" w:tentative="1">
-      <w:start w:val="1"/>
-      <w:numFmt w:val="decimal"/>
-      <w:lvlText w:val="%5."/>
-      <w:lvlJc w:val="left"/>
-      <w:pPr>
-        <w:tabs>
-          <w:tab w:val="num" w:pos="3600"/>
-        </w:tabs>
-        <w:ind w:left="3600" w:hanging="360"/>
-      </w:pPr>
-    </w:lvl>
-    <w:lvl w:ilvl="5" w:tentative="1">
-      <w:start w:val="1"/>
-      <w:numFmt w:val="decimal"/>
-      <w:lvlText w:val="%6."/>
-      <w:lvlJc w:val="left"/>
-      <w:pPr>
-        <w:tabs>
-          <w:tab w:val="num" w:pos="4320"/>
-        </w:tabs>
-        <w:ind w:left="4320" w:hanging="360"/>
-      </w:pPr>
-    </w:lvl>
-    <w:lvl w:ilvl="6" w:tentative="1">
-      <w:start w:val="1"/>
-      <w:numFmt w:val="decimal"/>
-      <w:lvlText w:val="%7."/>
-      <w:lvlJc w:val="left"/>
-      <w:pPr>
-        <w:tabs>
-          <w:tab w:val="num" w:pos="5040"/>
-        </w:tabs>
-        <w:ind w:left="5040" w:hanging="360"/>
-      </w:pPr>
-    </w:lvl>
-    <w:lvl w:ilvl="7" w:tentative="1">
-      <w:start w:val="1"/>
-      <w:numFmt w:val="decimal"/>
-      <w:lvlText w:val="%8."/>
-      <w:lvlJc w:val="left"/>
-      <w:pPr>
-        <w:tabs>
-          <w:tab w:val="num" w:pos="5760"/>
-        </w:tabs>
-        <w:ind w:left="5760" w:hanging="360"/>
-      </w:pPr>
-    </w:lvl>
-    <w:lvl w:ilvl="8" w:tentative="1">
-      <w:start w:val="1"/>
-      <w:numFmt w:val="decimal"/>
-      <w:lvlText w:val="%9."/>
-      <w:lvlJc w:val="left"/>
-      <w:pPr>
-        <w:tabs>
-          <w:tab w:val="num" w:pos="6480"/>
-        </w:tabs>
-        <w:ind w:left="6480" w:hanging="360"/>
-      </w:pPr>
-    </w:lvl>
-  </w:abstractNum>
-  <w:abstractNum w:abstractNumId="10" w15:restartNumberingAfterBreak="0">
-    <w:nsid w:val="7AE332DB"/>
-    <w:multiLevelType w:val="multilevel"/>
-    <w:tmpl w:val="8F7AAF20"/>
+    <w:tmpl w:val="F0080D26"/>
     <w:lvl w:ilvl="0">
       <w:start w:val="1"/>
       <w:numFmt w:val="bullet"/>
@@ -11296,10 +9187,10 @@
       </w:rPr>
     </w:lvl>
   </w:abstractNum>
-  <w:abstractNum w:abstractNumId="11" w15:restartNumberingAfterBreak="0">
-    <w:nsid w:val="7E165461"/>
+  <w:abstractNum w:abstractNumId="12" w15:restartNumberingAfterBreak="0">
+    <w:nsid w:val="78CF5F82"/>
     <w:multiLevelType w:val="multilevel"/>
-    <w:tmpl w:val="A7142E98"/>
+    <w:tmpl w:val="72F6A6A2"/>
     <w:lvl w:ilvl="0">
       <w:start w:val="1"/>
       <w:numFmt w:val="bullet"/>
@@ -11445,157 +9336,44 @@
       </w:rPr>
     </w:lvl>
   </w:abstractNum>
-  <w:abstractNum w:abstractNumId="12" w15:restartNumberingAfterBreak="0">
-    <w:nsid w:val="7F4D0DB2"/>
-    <w:multiLevelType w:val="multilevel"/>
-    <w:tmpl w:val="1E82E5DC"/>
-    <w:lvl w:ilvl="0">
-      <w:start w:val="1"/>
-      <w:numFmt w:val="decimal"/>
-      <w:lvlText w:val="%1."/>
-      <w:lvlJc w:val="left"/>
-      <w:pPr>
-        <w:tabs>
-          <w:tab w:val="num" w:pos="720"/>
-        </w:tabs>
-        <w:ind w:left="720" w:hanging="360"/>
-      </w:pPr>
-    </w:lvl>
-    <w:lvl w:ilvl="1" w:tentative="1">
-      <w:start w:val="1"/>
-      <w:numFmt w:val="decimal"/>
-      <w:lvlText w:val="%2."/>
-      <w:lvlJc w:val="left"/>
-      <w:pPr>
-        <w:tabs>
-          <w:tab w:val="num" w:pos="1440"/>
-        </w:tabs>
-        <w:ind w:left="1440" w:hanging="360"/>
-      </w:pPr>
-    </w:lvl>
-    <w:lvl w:ilvl="2" w:tentative="1">
-      <w:start w:val="1"/>
-      <w:numFmt w:val="decimal"/>
-      <w:lvlText w:val="%3."/>
-      <w:lvlJc w:val="left"/>
-      <w:pPr>
-        <w:tabs>
-          <w:tab w:val="num" w:pos="2160"/>
-        </w:tabs>
-        <w:ind w:left="2160" w:hanging="360"/>
-      </w:pPr>
-    </w:lvl>
-    <w:lvl w:ilvl="3" w:tentative="1">
-      <w:start w:val="1"/>
-      <w:numFmt w:val="decimal"/>
-      <w:lvlText w:val="%4."/>
-      <w:lvlJc w:val="left"/>
-      <w:pPr>
-        <w:tabs>
-          <w:tab w:val="num" w:pos="2880"/>
-        </w:tabs>
-        <w:ind w:left="2880" w:hanging="360"/>
-      </w:pPr>
-    </w:lvl>
-    <w:lvl w:ilvl="4" w:tentative="1">
-      <w:start w:val="1"/>
-      <w:numFmt w:val="decimal"/>
-      <w:lvlText w:val="%5."/>
-      <w:lvlJc w:val="left"/>
-      <w:pPr>
-        <w:tabs>
-          <w:tab w:val="num" w:pos="3600"/>
-        </w:tabs>
-        <w:ind w:left="3600" w:hanging="360"/>
-      </w:pPr>
-    </w:lvl>
-    <w:lvl w:ilvl="5" w:tentative="1">
-      <w:start w:val="1"/>
-      <w:numFmt w:val="decimal"/>
-      <w:lvlText w:val="%6."/>
-      <w:lvlJc w:val="left"/>
-      <w:pPr>
-        <w:tabs>
-          <w:tab w:val="num" w:pos="4320"/>
-        </w:tabs>
-        <w:ind w:left="4320" w:hanging="360"/>
-      </w:pPr>
-    </w:lvl>
-    <w:lvl w:ilvl="6" w:tentative="1">
-      <w:start w:val="1"/>
-      <w:numFmt w:val="decimal"/>
-      <w:lvlText w:val="%7."/>
-      <w:lvlJc w:val="left"/>
-      <w:pPr>
-        <w:tabs>
-          <w:tab w:val="num" w:pos="5040"/>
-        </w:tabs>
-        <w:ind w:left="5040" w:hanging="360"/>
-      </w:pPr>
-    </w:lvl>
-    <w:lvl w:ilvl="7" w:tentative="1">
-      <w:start w:val="1"/>
-      <w:numFmt w:val="decimal"/>
-      <w:lvlText w:val="%8."/>
-      <w:lvlJc w:val="left"/>
-      <w:pPr>
-        <w:tabs>
-          <w:tab w:val="num" w:pos="5760"/>
-        </w:tabs>
-        <w:ind w:left="5760" w:hanging="360"/>
-      </w:pPr>
-    </w:lvl>
-    <w:lvl w:ilvl="8" w:tentative="1">
-      <w:start w:val="1"/>
-      <w:numFmt w:val="decimal"/>
-      <w:lvlText w:val="%9."/>
-      <w:lvlJc w:val="left"/>
-      <w:pPr>
-        <w:tabs>
-          <w:tab w:val="num" w:pos="6480"/>
-        </w:tabs>
-        <w:ind w:left="6480" w:hanging="360"/>
-      </w:pPr>
-    </w:lvl>
-  </w:abstractNum>
-  <w:num w:numId="1" w16cid:durableId="1748186842">
-    <w:abstractNumId w:val="12"/>
+  <w:num w:numId="1" w16cid:durableId="1749377718">
+    <w:abstractNumId w:val="5"/>
   </w:num>
-  <w:num w:numId="2" w16cid:durableId="313074586">
+  <w:num w:numId="2" w16cid:durableId="640380119">
     <w:abstractNumId w:val="0"/>
   </w:num>
-  <w:num w:numId="3" w16cid:durableId="457377852">
+  <w:num w:numId="3" w16cid:durableId="51082589">
     <w:abstractNumId w:val="9"/>
   </w:num>
-  <w:num w:numId="4" w16cid:durableId="145784554">
+  <w:num w:numId="4" w16cid:durableId="1714691456">
     <w:abstractNumId w:val="3"/>
   </w:num>
-  <w:num w:numId="5" w16cid:durableId="116727933">
+  <w:num w:numId="5" w16cid:durableId="1227644423">
+    <w:abstractNumId w:val="8"/>
+  </w:num>
+  <w:num w:numId="6" w16cid:durableId="1340237556">
+    <w:abstractNumId w:val="6"/>
+  </w:num>
+  <w:num w:numId="7" w16cid:durableId="1528131786">
+    <w:abstractNumId w:val="11"/>
+  </w:num>
+  <w:num w:numId="8" w16cid:durableId="686366550">
+    <w:abstractNumId w:val="2"/>
+  </w:num>
+  <w:num w:numId="9" w16cid:durableId="1731614595">
     <w:abstractNumId w:val="4"/>
   </w:num>
-  <w:num w:numId="6" w16cid:durableId="340200979">
-    <w:abstractNumId w:val="5"/>
+  <w:num w:numId="10" w16cid:durableId="529489936">
+    <w:abstractNumId w:val="10"/>
   </w:num>
-  <w:num w:numId="7" w16cid:durableId="1076627537">
-    <w:abstractNumId w:val="2"/>
-  </w:num>
-  <w:num w:numId="8" w16cid:durableId="907418364">
-    <w:abstractNumId w:val="6"/>
-  </w:num>
-  <w:num w:numId="9" w16cid:durableId="1911503917">
-    <w:abstractNumId w:val="11"/>
-  </w:num>
-  <w:num w:numId="10" w16cid:durableId="1113669104">
+  <w:num w:numId="11" w16cid:durableId="1493182570">
     <w:abstractNumId w:val="7"/>
   </w:num>
-  <w:num w:numId="11" w16cid:durableId="236287714">
-    <w:abstractNumId w:val="8"/>
-  </w:num>
-  <w:num w:numId="12" w16cid:durableId="1511991743">
+  <w:num w:numId="12" w16cid:durableId="1109859858">
     <w:abstractNumId w:val="1"/>
   </w:num>
-  <w:num w:numId="13" w16cid:durableId="2136681375">
-    <w:abstractNumId w:val="10"/>
+  <w:num w:numId="13" w16cid:durableId="250969895">
+    <w:abstractNumId w:val="12"/>
   </w:num>
 </w:numbering>
 </file>

</xml_diff>

<commit_message>
docs+ui: reframe `fraud detection'' as `risk review / document consistency'' in user-facing copy
Keeps all internal API/code identifiers (FraudFinding, fraud_findings, fraud_type, fraud_detection score key, fraud/ dir, FraudDetectionAgent class) and the GitHub repo URL unchanged - only user-visible strings in READMEs, GEMINI.md, solution doc, and frontend pages are reworded.
</commit_message>
<xml_diff>
--- a/docs/solution/Landshield-Solution-Document.docx
+++ b/docs/solution/Landshield-Solution-Document.docx
@@ -1372,16 +1372,21 @@
       <w:r>
         <w:rPr>
           <w:rFonts w:ascii="Calibri" w:hAnsi="Calibri" w:cs="Calibri"/>
-          <w:noProof/>
           <w:color w:val="202124"/>
           <w:sz w:val="22"/>
           <w:szCs w:val="22"/>
         </w:rPr>
         <w:drawing>
-          <wp:inline distT="0" distB="0" distL="0" distR="0" wp14:anchorId="4D7CCDE3" wp14:editId="47F35548">
-            <wp:extent cx="12192627" cy="6858352"/>
-            <wp:effectExtent l="0" t="0" r="0" b="0"/>
-            <wp:docPr id="5" name="Picture 5" descr="Agent flow diagram"/>
+          <wp:inline distT="0" distB="0" distL="0" distR="0" wp14:anchorId="1736C306" wp14:editId="1984C049">
+            <wp:extent cx="5943600" cy="3345180"/>
+            <wp:effectExtent l="0" t="0" r="0" b="7620"/>
+            <wp:docPr id="24" name="Picture 23">
+              <a:extLst xmlns:a="http://schemas.openxmlformats.org/drawingml/2006/main">
+                <a:ext uri="{FF2B5EF4-FFF2-40B4-BE49-F238E27FC236}">
+                  <a16:creationId xmlns:a16="http://schemas.microsoft.com/office/drawing/2014/main" id="{778DDBA9-5716-F0B0-E479-298C1DD124A6}"/>
+                </a:ext>
+              </a:extLst>
+            </wp:docPr>
             <wp:cNvGraphicFramePr>
               <a:graphicFrameLocks xmlns:a="http://schemas.openxmlformats.org/drawingml/2006/main" noChangeAspect="1"/>
             </wp:cNvGraphicFramePr>
@@ -1389,36 +1394,31 @@
               <a:graphicData uri="http://schemas.openxmlformats.org/drawingml/2006/picture">
                 <pic:pic xmlns:pic="http://schemas.openxmlformats.org/drawingml/2006/picture">
                   <pic:nvPicPr>
-                    <pic:cNvPr id="0" name="Picture 5" descr="Agent flow diagram"/>
+                    <pic:cNvPr id="24" name="Picture 23">
+                      <a:extLst>
+                        <a:ext uri="{FF2B5EF4-FFF2-40B4-BE49-F238E27FC236}">
+                          <a16:creationId xmlns:a16="http://schemas.microsoft.com/office/drawing/2014/main" id="{778DDBA9-5716-F0B0-E479-298C1DD124A6}"/>
+                        </a:ext>
+                      </a:extLst>
+                    </pic:cNvPr>
                     <pic:cNvPicPr>
-                      <a:picLocks noChangeAspect="1" noChangeArrowheads="1"/>
+                      <a:picLocks noChangeAspect="1"/>
                     </pic:cNvPicPr>
                   </pic:nvPicPr>
                   <pic:blipFill>
-                    <a:blip r:link="rId5">
-                      <a:extLst>
-                        <a:ext uri="{28A0092B-C50C-407E-A947-70E740481C1C}">
-                          <a14:useLocalDpi xmlns:a14="http://schemas.microsoft.com/office/drawing/2010/main" val="0"/>
-                        </a:ext>
-                      </a:extLst>
-                    </a:blip>
-                    <a:srcRect/>
+                    <a:blip r:embed="rId5"/>
                     <a:stretch>
                       <a:fillRect/>
                     </a:stretch>
                   </pic:blipFill>
-                  <pic:spPr bwMode="auto">
+                  <pic:spPr>
                     <a:xfrm>
                       <a:off x="0" y="0"/>
-                      <a:ext cx="12192627" cy="6858352"/>
+                      <a:ext cx="5943600" cy="3345180"/>
                     </a:xfrm>
                     <a:prstGeom prst="rect">
                       <a:avLst/>
                     </a:prstGeom>
-                    <a:noFill/>
-                    <a:ln>
-                      <a:noFill/>
-                    </a:ln>
                   </pic:spPr>
                 </pic:pic>
               </a:graphicData>
@@ -1463,7 +1463,6 @@
           <w:sz w:val="22"/>
           <w:szCs w:val="22"/>
         </w:rPr>
-        <w:lastRenderedPageBreak/>
         <w:t>Buyer signs in (Firebase Auth) and uploads a bundle (sale deed, EC, mutation, tax receipts, building plan).</w:t>
       </w:r>
     </w:p>
@@ -1774,7 +1773,7 @@
           <w:szCs w:val="22"/>
         </w:rPr>
         <w:pict w14:anchorId="5D1B8080">
-          <v:rect id="_x0000_i1030" style="width:0;height:1.5pt" o:hralign="center" o:hrstd="t" o:hr="t" fillcolor="#a0a0a0" stroked="f"/>
+          <v:rect id="_x0000_i1029" style="width:0;height:1.5pt" o:hralign="center" o:hrstd="t" o:hr="t" fillcolor="#a0a0a0" stroked="f"/>
         </w:pict>
       </w:r>
     </w:p>
@@ -1789,6 +1788,7 @@
         <w:rPr>
           <w:rFonts w:eastAsia="Times New Roman"/>
         </w:rPr>
+        <w:lastRenderedPageBreak/>
         <w:t>Section 5: Architecture Diagram — GCP Services Used</w:t>
       </w:r>
     </w:p>
@@ -1805,17 +1805,21 @@
       <w:r>
         <w:rPr>
           <w:rFonts w:ascii="Calibri" w:hAnsi="Calibri" w:cs="Calibri"/>
-          <w:noProof/>
-          <w:color w:val="202124"/>
-          <w:sz w:val="22"/>
-          <w:szCs w:val="22"/>
-        </w:rPr>
-        <w:lastRenderedPageBreak/>
+          <w:color w:val="202124"/>
+          <w:sz w:val="22"/>
+          <w:szCs w:val="22"/>
+        </w:rPr>
         <w:drawing>
-          <wp:inline distT="0" distB="0" distL="0" distR="0" wp14:anchorId="031D8412" wp14:editId="1E606AA7">
-            <wp:extent cx="12192627" cy="6858352"/>
-            <wp:effectExtent l="0" t="0" r="0" b="0"/>
-            <wp:docPr id="7" name="Picture 7" descr="Architecture diagram"/>
+          <wp:inline distT="0" distB="0" distL="0" distR="0" wp14:anchorId="5FEABDF0" wp14:editId="6AC71C52">
+            <wp:extent cx="5943600" cy="3482975"/>
+            <wp:effectExtent l="0" t="0" r="0" b="3175"/>
+            <wp:docPr id="15" name="Picture 14">
+              <a:extLst xmlns:a="http://schemas.openxmlformats.org/drawingml/2006/main">
+                <a:ext uri="{FF2B5EF4-FFF2-40B4-BE49-F238E27FC236}">
+                  <a16:creationId xmlns:a16="http://schemas.microsoft.com/office/drawing/2014/main" id="{43411EB3-19F5-BA62-9CC2-137C7EE14B84}"/>
+                </a:ext>
+              </a:extLst>
+            </wp:docPr>
             <wp:cNvGraphicFramePr>
               <a:graphicFrameLocks xmlns:a="http://schemas.openxmlformats.org/drawingml/2006/main" noChangeAspect="1"/>
             </wp:cNvGraphicFramePr>
@@ -1823,36 +1827,31 @@
               <a:graphicData uri="http://schemas.openxmlformats.org/drawingml/2006/picture">
                 <pic:pic xmlns:pic="http://schemas.openxmlformats.org/drawingml/2006/picture">
                   <pic:nvPicPr>
-                    <pic:cNvPr id="0" name="Picture 7" descr="Architecture diagram"/>
+                    <pic:cNvPr id="15" name="Picture 14">
+                      <a:extLst>
+                        <a:ext uri="{FF2B5EF4-FFF2-40B4-BE49-F238E27FC236}">
+                          <a16:creationId xmlns:a16="http://schemas.microsoft.com/office/drawing/2014/main" id="{43411EB3-19F5-BA62-9CC2-137C7EE14B84}"/>
+                        </a:ext>
+                      </a:extLst>
+                    </pic:cNvPr>
                     <pic:cNvPicPr>
-                      <a:picLocks noChangeAspect="1" noChangeArrowheads="1"/>
+                      <a:picLocks noChangeAspect="1"/>
                     </pic:cNvPicPr>
                   </pic:nvPicPr>
                   <pic:blipFill>
-                    <a:blip r:link="rId6">
-                      <a:extLst>
-                        <a:ext uri="{28A0092B-C50C-407E-A947-70E740481C1C}">
-                          <a14:useLocalDpi xmlns:a14="http://schemas.microsoft.com/office/drawing/2010/main" val="0"/>
-                        </a:ext>
-                      </a:extLst>
-                    </a:blip>
-                    <a:srcRect/>
+                    <a:blip r:embed="rId6"/>
                     <a:stretch>
                       <a:fillRect/>
                     </a:stretch>
                   </pic:blipFill>
-                  <pic:spPr bwMode="auto">
+                  <pic:spPr>
                     <a:xfrm>
                       <a:off x="0" y="0"/>
-                      <a:ext cx="12192627" cy="6858352"/>
+                      <a:ext cx="5943600" cy="3482975"/>
                     </a:xfrm>
                     <a:prstGeom prst="rect">
                       <a:avLst/>
                     </a:prstGeom>
-                    <a:noFill/>
-                    <a:ln>
-                      <a:noFill/>
-                    </a:ln>
                   </pic:spPr>
                 </pic:pic>
               </a:graphicData>
@@ -1933,7 +1932,6 @@
                 <w:sz w:val="21"/>
                 <w:szCs w:val="21"/>
               </w:rPr>
-              <w:lastRenderedPageBreak/>
               <w:t>GCP Service</w:t>
             </w:r>
           </w:p>
@@ -2461,6 +2459,7 @@
                 <w:sz w:val="21"/>
                 <w:szCs w:val="21"/>
               </w:rPr>
+              <w:lastRenderedPageBreak/>
               <w:t>BigQuery</w:t>
             </w:r>
           </w:p>
@@ -2997,7 +2996,7 @@
           <w:szCs w:val="22"/>
         </w:rPr>
         <w:pict w14:anchorId="73E8406A">
-          <v:rect id="_x0000_i1032" style="width:0;height:1.5pt" o:hralign="center" o:hrstd="t" o:hr="t" fillcolor="#a0a0a0" stroked="f"/>
+          <v:rect id="_x0000_i1030" style="width:0;height:1.5pt" o:hralign="center" o:hrstd="t" o:hr="t" fillcolor="#a0a0a0" stroked="f"/>
         </w:pict>
       </w:r>
     </w:p>
@@ -3012,7 +3011,6 @@
         <w:rPr>
           <w:rFonts w:eastAsia="Times New Roman"/>
         </w:rPr>
-        <w:lastRenderedPageBreak/>
         <w:t>Section 6: Key Tasks, Workflows &amp; Capabilities</w:t>
       </w:r>
     </w:p>
@@ -3132,16 +3130,7 @@
           <w:sz w:val="22"/>
           <w:szCs w:val="22"/>
         </w:rPr>
-        <w:t xml:space="preserve"> </w:t>
-      </w:r>
-      <w:r>
-        <w:rPr>
-          <w:rFonts w:ascii="Calibri" w:eastAsia="Times New Roman" w:hAnsi="Calibri" w:cs="Calibri"/>
-          <w:color w:val="202124"/>
-          <w:sz w:val="22"/>
-          <w:szCs w:val="22"/>
-        </w:rPr>
-        <w:t>— match party names across documents tolerant of transliteration variants (Hindi/Urdu/regional script).</w:t>
+        <w:t xml:space="preserve"> — match party names across documents tolerant of transliteration variants (Hindi/Urdu/regional script).</w:t>
       </w:r>
     </w:p>
     <w:p>
@@ -3237,6 +3226,7 @@
           <w:sz w:val="22"/>
           <w:szCs w:val="22"/>
         </w:rPr>
+        <w:lastRenderedPageBreak/>
         <w:t>State-specific rule enforcement</w:t>
       </w:r>
       <w:r>
@@ -3402,16 +3392,7 @@
           <w:sz w:val="22"/>
           <w:szCs w:val="22"/>
         </w:rPr>
-        <w:t xml:space="preserve"> </w:t>
-      </w:r>
-      <w:r>
-        <w:rPr>
-          <w:rFonts w:ascii="Calibri" w:eastAsia="Times New Roman" w:hAnsi="Calibri" w:cs="Calibri"/>
-          <w:color w:val="202124"/>
-          <w:sz w:val="22"/>
-          <w:szCs w:val="22"/>
-        </w:rPr>
-        <w:t>— every finding linked back to source document + page; persisted for compliance.</w:t>
+        <w:t xml:space="preserve"> — every finding linked back to source document + page; persisted for compliance.</w:t>
       </w:r>
     </w:p>
     <w:p>
@@ -3868,7 +3849,6 @@
                 <w:sz w:val="21"/>
                 <w:szCs w:val="21"/>
               </w:rPr>
-              <w:lastRenderedPageBreak/>
               <w:t>Validate against state land law</w:t>
             </w:r>
           </w:p>
@@ -4433,7 +4413,7 @@
           <w:szCs w:val="22"/>
         </w:rPr>
         <w:pict w14:anchorId="2FFC18BF">
-          <v:rect id="_x0000_i1033" style="width:0;height:1.5pt" o:hralign="center" o:hrstd="t" o:hr="t" fillcolor="#a0a0a0" stroked="f"/>
+          <v:rect id="_x0000_i1031" style="width:0;height:1.5pt" o:hralign="center" o:hrstd="t" o:hr="t" fillcolor="#a0a0a0" stroked="f"/>
         </w:pict>
       </w:r>
     </w:p>
@@ -4448,6 +4428,7 @@
         <w:rPr>
           <w:rFonts w:eastAsia="Times New Roman"/>
         </w:rPr>
+        <w:lastRenderedPageBreak/>
         <w:t>Section 7: Business Impact</w:t>
       </w:r>
     </w:p>
@@ -4497,16 +4478,7 @@
           <w:sz w:val="22"/>
           <w:szCs w:val="22"/>
         </w:rPr>
-        <w:t xml:space="preserve"> </w:t>
-      </w:r>
-      <w:r>
-        <w:rPr>
-          <w:rFonts w:ascii="Calibri" w:eastAsia="Times New Roman" w:hAnsi="Calibri" w:cs="Calibri"/>
-          <w:color w:val="202124"/>
-          <w:sz w:val="22"/>
-          <w:szCs w:val="22"/>
-        </w:rPr>
-        <w:t>4–8 weeks → under 90 seconds.</w:t>
+        <w:t xml:space="preserve"> 4–8 weeks → under 90 seconds.</w:t>
       </w:r>
     </w:p>
     <w:p>
@@ -4807,7 +4779,6 @@
         <w:rPr>
           <w:rFonts w:eastAsia="Times New Roman"/>
         </w:rPr>
-        <w:lastRenderedPageBreak/>
         <w:t>Macro impact (India)</w:t>
       </w:r>
     </w:p>
@@ -5346,6 +5317,7 @@
                 <w:sz w:val="21"/>
                 <w:szCs w:val="21"/>
               </w:rPr>
+              <w:lastRenderedPageBreak/>
               <w:t>Fraud caught early</w:t>
             </w:r>
           </w:p>
@@ -5446,7 +5418,7 @@
           <w:szCs w:val="22"/>
         </w:rPr>
         <w:pict w14:anchorId="754E2323">
-          <v:rect id="_x0000_i1034" style="width:0;height:1.5pt" o:hralign="center" o:hrstd="t" o:hr="t" fillcolor="#a0a0a0" stroked="f"/>
+          <v:rect id="_x0000_i1032" style="width:0;height:1.5pt" o:hralign="center" o:hrstd="t" o:hr="t" fillcolor="#a0a0a0" stroked="f"/>
         </w:pict>
       </w:r>
     </w:p>
@@ -5510,16 +5482,7 @@
           <w:sz w:val="22"/>
           <w:szCs w:val="22"/>
         </w:rPr>
-        <w:t xml:space="preserve"> </w:t>
-      </w:r>
-      <w:r>
-        <w:rPr>
-          <w:rFonts w:ascii="Calibri" w:eastAsia="Times New Roman" w:hAnsi="Calibri" w:cs="Calibri"/>
-          <w:color w:val="202124"/>
-          <w:sz w:val="22"/>
-          <w:szCs w:val="22"/>
-        </w:rPr>
-        <w:t>PDF bundle (1–15 documents per deal, typically 8); declared state, district, land type (agricultural / non-agricultural / tribal / residential / commercial).</w:t>
+        <w:t xml:space="preserve"> PDF bundle (1–15 documents per deal, typically 8); declared state, district, land type (agricultural / non-agricultural / tribal / residential / commercial).</w:t>
       </w:r>
     </w:p>
     <w:p>
@@ -5750,15 +5713,245 @@
           <w:rStyle w:val="HTMLCode"/>
           <w:color w:val="202124"/>
         </w:rPr>
+        <w:t xml:space="preserve">    { "role": "seller", "name": "S. Ramesh",      "father_name": "Krishna" },</w:t>
+      </w:r>
+    </w:p>
+    <w:p>
+      <w:pPr>
+        <w:pStyle w:val="HTMLPreformatted"/>
+        <w:rPr>
+          <w:rStyle w:val="HTMLCode"/>
+          <w:color w:val="202124"/>
+        </w:rPr>
+      </w:pPr>
+      <w:r>
+        <w:rPr>
+          <w:rStyle w:val="HTMLCode"/>
+          <w:color w:val="202124"/>
+        </w:rPr>
+        <w:t xml:space="preserve">    { "role": "buyer",  "name": "Anita Sharma",   "father_name": "Rajeev" }</w:t>
+      </w:r>
+    </w:p>
+    <w:p>
+      <w:pPr>
+        <w:pStyle w:val="HTMLPreformatted"/>
+        <w:rPr>
+          <w:rStyle w:val="HTMLCode"/>
+          <w:color w:val="202124"/>
+        </w:rPr>
+      </w:pPr>
+      <w:r>
+        <w:rPr>
+          <w:rStyle w:val="HTMLCode"/>
+          <w:color w:val="202124"/>
+        </w:rPr>
+        <w:t xml:space="preserve">  ],</w:t>
+      </w:r>
+    </w:p>
+    <w:p>
+      <w:pPr>
+        <w:pStyle w:val="HTMLPreformatted"/>
+        <w:rPr>
+          <w:rStyle w:val="HTMLCode"/>
+          <w:color w:val="202124"/>
+        </w:rPr>
+      </w:pPr>
+      <w:r>
+        <w:rPr>
+          <w:rStyle w:val="HTMLCode"/>
+          <w:color w:val="202124"/>
+        </w:rPr>
+        <w:t xml:space="preserve">  "property": { "survey_numbers": ["43/2A"], "khata": "B-1234",</w:t>
+      </w:r>
+    </w:p>
+    <w:p>
+      <w:pPr>
+        <w:pStyle w:val="HTMLPreformatted"/>
+        <w:rPr>
+          <w:rStyle w:val="HTMLCode"/>
+          <w:color w:val="202124"/>
+        </w:rPr>
+      </w:pPr>
+      <w:r>
+        <w:rPr>
+          <w:rStyle w:val="HTMLCode"/>
+          <w:color w:val="202124"/>
+        </w:rPr>
+        <w:t xml:space="preserve">                "area_sqft": 1200, "state": "Karnataka", "district": "Bengaluru-Urban" },</w:t>
+      </w:r>
+    </w:p>
+    <w:p>
+      <w:pPr>
+        <w:pStyle w:val="HTMLPreformatted"/>
+        <w:rPr>
+          <w:rStyle w:val="HTMLCode"/>
+          <w:color w:val="202124"/>
+        </w:rPr>
+      </w:pPr>
+      <w:r>
+        <w:rPr>
+          <w:rStyle w:val="HTMLCode"/>
+          <w:color w:val="202124"/>
+        </w:rPr>
+        <w:t xml:space="preserve">  "consideration": { "amount_inr": 8500000, "stamp_duty_inr": 425000 },</w:t>
+      </w:r>
+    </w:p>
+    <w:p>
+      <w:pPr>
+        <w:pStyle w:val="HTMLPreformatted"/>
+        <w:rPr>
+          <w:rStyle w:val="HTMLCode"/>
+          <w:color w:val="202124"/>
+        </w:rPr>
+      </w:pPr>
+      <w:r>
+        <w:rPr>
+          <w:rStyle w:val="HTMLCode"/>
+          <w:color w:val="202124"/>
+        </w:rPr>
+        <w:t xml:space="preserve">  "chain_of_title": [ { "from": "K. Subbaiah", "to": "S. Ramesh", "year": 2015 } ]</w:t>
+      </w:r>
+    </w:p>
+    <w:p>
+      <w:pPr>
+        <w:pStyle w:val="HTMLPreformatted"/>
+        <w:rPr>
+          <w:color w:val="202124"/>
+        </w:rPr>
+      </w:pPr>
+      <w:r>
+        <w:rPr>
+          <w:rStyle w:val="HTMLCode"/>
+          <w:color w:val="202124"/>
+        </w:rPr>
+        <w:t>}</w:t>
+      </w:r>
+    </w:p>
+    <w:p>
+      <w:pPr>
+        <w:pStyle w:val="Heading3"/>
+        <w:rPr>
+          <w:rFonts w:eastAsia="Times New Roman"/>
+        </w:rPr>
+      </w:pPr>
+      <w:r>
+        <w:rPr>
+          <w:rFonts w:eastAsia="Times New Roman"/>
+        </w:rPr>
+        <w:t>Output</w:t>
+      </w:r>
+    </w:p>
+    <w:p>
+      <w:pPr>
+        <w:pStyle w:val="HTMLPreformatted"/>
+        <w:rPr>
+          <w:rStyle w:val="HTMLCode"/>
+          <w:color w:val="202124"/>
+        </w:rPr>
+      </w:pPr>
+      <w:r>
+        <w:rPr>
+          <w:rStyle w:val="HTMLCode"/>
+          <w:color w:val="202124"/>
+        </w:rPr>
+        <w:t>{</w:t>
+      </w:r>
+    </w:p>
+    <w:p>
+      <w:pPr>
+        <w:pStyle w:val="HTMLPreformatted"/>
+        <w:rPr>
+          <w:rStyle w:val="HTMLCode"/>
+          <w:color w:val="202124"/>
+        </w:rPr>
+      </w:pPr>
+      <w:r>
+        <w:rPr>
+          <w:rStyle w:val="HTMLCode"/>
+          <w:color w:val="202124"/>
+        </w:rPr>
+        <w:t xml:space="preserve">  "verdict": "clarify",</w:t>
+      </w:r>
+    </w:p>
+    <w:p>
+      <w:pPr>
+        <w:pStyle w:val="HTMLPreformatted"/>
+        <w:rPr>
+          <w:rStyle w:val="HTMLCode"/>
+          <w:color w:val="202124"/>
+        </w:rPr>
+      </w:pPr>
+      <w:r>
+        <w:rPr>
+          <w:rStyle w:val="HTMLCode"/>
+          <w:color w:val="202124"/>
+        </w:rPr>
+        <w:t xml:space="preserve">  "risk_score": 47,</w:t>
+      </w:r>
+    </w:p>
+    <w:p>
+      <w:pPr>
+        <w:pStyle w:val="HTMLPreformatted"/>
+        <w:rPr>
+          <w:rStyle w:val="HTMLCode"/>
+          <w:color w:val="202124"/>
+        </w:rPr>
+      </w:pPr>
+      <w:r>
+        <w:rPr>
+          <w:rStyle w:val="HTMLCode"/>
+          <w:color w:val="202124"/>
+        </w:rPr>
+        <w:t xml:space="preserve">  "severity_counts": { "low": 3, "medium": 4, "high": 2, "critical": 0 },</w:t>
+      </w:r>
+    </w:p>
+    <w:p>
+      <w:pPr>
+        <w:pStyle w:val="HTMLPreformatted"/>
+        <w:rPr>
+          <w:rStyle w:val="HTMLCode"/>
+          <w:color w:val="202124"/>
+        </w:rPr>
+      </w:pPr>
+      <w:r>
+        <w:rPr>
+          <w:rStyle w:val="HTMLCode"/>
+          <w:color w:val="202124"/>
+        </w:rPr>
+        <w:t xml:space="preserve">  "findings": [</w:t>
+      </w:r>
+    </w:p>
+    <w:p>
+      <w:pPr>
+        <w:pStyle w:val="HTMLPreformatted"/>
+        <w:rPr>
+          <w:rStyle w:val="HTMLCode"/>
+          <w:color w:val="202124"/>
+        </w:rPr>
+      </w:pPr>
+      <w:r>
+        <w:rPr>
+          <w:rStyle w:val="HTMLCode"/>
+          <w:color w:val="202124"/>
+        </w:rPr>
         <w:lastRenderedPageBreak/>
-        <w:t xml:space="preserve">    { "</w:t>
-      </w:r>
-      <w:r>
+        <w:t xml:space="preserve">    { "agent": "fraud",</w:t>
+      </w:r>
+    </w:p>
+    <w:p>
+      <w:pPr>
+        <w:pStyle w:val="HTMLPreformatted"/>
         <w:rPr>
           <w:rStyle w:val="HTMLCode"/>
           <w:color w:val="202124"/>
         </w:rPr>
-        <w:t>role": "seller", "name": "S. Ramesh",      "father_name": "Krishna" },</w:t>
+      </w:pPr>
+      <w:r>
+        <w:rPr>
+          <w:rStyle w:val="HTMLCode"/>
+          <w:color w:val="202124"/>
+        </w:rPr>
+        <w:t xml:space="preserve">      "fraud_type": "name_mismatch",</w:t>
       </w:r>
     </w:p>
     <w:p>
@@ -5774,7 +5967,7 @@
           <w:rStyle w:val="HTMLCode"/>
           <w:color w:val="202124"/>
         </w:rPr>
-        <w:t xml:space="preserve">    { "role": "buyer",  "name": "Anita Sharma",   "father_name": "Rajeev" }</w:t>
+        <w:t xml:space="preserve">      "severity": "high",</w:t>
       </w:r>
     </w:p>
     <w:p>
@@ -5790,6 +5983,134 @@
           <w:rStyle w:val="HTMLCode"/>
           <w:color w:val="202124"/>
         </w:rPr>
+        <w:t xml:space="preserve">      "summary": "Seller name on sale deed differs from EC (S. Ramesh vs Ramesh S.).",</w:t>
+      </w:r>
+    </w:p>
+    <w:p>
+      <w:pPr>
+        <w:pStyle w:val="HTMLPreformatted"/>
+        <w:rPr>
+          <w:rStyle w:val="HTMLCode"/>
+          <w:color w:val="202124"/>
+        </w:rPr>
+      </w:pPr>
+      <w:r>
+        <w:rPr>
+          <w:rStyle w:val="HTMLCode"/>
+          <w:color w:val="202124"/>
+        </w:rPr>
+        <w:t xml:space="preserve">      "evidence": ["sale_deed.pdf#p2", "ec.pdf#p1"],</w:t>
+      </w:r>
+    </w:p>
+    <w:p>
+      <w:pPr>
+        <w:pStyle w:val="HTMLPreformatted"/>
+        <w:rPr>
+          <w:rStyle w:val="HTMLCode"/>
+          <w:color w:val="202124"/>
+        </w:rPr>
+      </w:pPr>
+      <w:r>
+        <w:rPr>
+          <w:rStyle w:val="HTMLCode"/>
+          <w:color w:val="202124"/>
+        </w:rPr>
+        <w:t xml:space="preserve">      "recommendation": "Obtain affidavit of name variation from seller." },</w:t>
+      </w:r>
+    </w:p>
+    <w:p>
+      <w:pPr>
+        <w:pStyle w:val="HTMLPreformatted"/>
+        <w:rPr>
+          <w:rStyle w:val="HTMLCode"/>
+          <w:color w:val="202124"/>
+        </w:rPr>
+      </w:pPr>
+      <w:r>
+        <w:rPr>
+          <w:rStyle w:val="HTMLCode"/>
+          <w:color w:val="202124"/>
+        </w:rPr>
+        <w:t xml:space="preserve">    { "agent": "legal",</w:t>
+      </w:r>
+    </w:p>
+    <w:p>
+      <w:pPr>
+        <w:pStyle w:val="HTMLPreformatted"/>
+        <w:rPr>
+          <w:rStyle w:val="HTMLCode"/>
+          <w:color w:val="202124"/>
+        </w:rPr>
+      </w:pPr>
+      <w:r>
+        <w:rPr>
+          <w:rStyle w:val="HTMLCode"/>
+          <w:color w:val="202124"/>
+        </w:rPr>
+        <w:t xml:space="preserve">      "issue": "stamp_duty_short",</w:t>
+      </w:r>
+    </w:p>
+    <w:p>
+      <w:pPr>
+        <w:pStyle w:val="HTMLPreformatted"/>
+        <w:rPr>
+          <w:rStyle w:val="HTMLCode"/>
+          <w:color w:val="202124"/>
+        </w:rPr>
+      </w:pPr>
+      <w:r>
+        <w:rPr>
+          <w:rStyle w:val="HTMLCode"/>
+          <w:color w:val="202124"/>
+        </w:rPr>
+        <w:t xml:space="preserve">      "severity": "medium",</w:t>
+      </w:r>
+    </w:p>
+    <w:p>
+      <w:pPr>
+        <w:pStyle w:val="HTMLPreformatted"/>
+        <w:rPr>
+          <w:rStyle w:val="HTMLCode"/>
+          <w:color w:val="202124"/>
+        </w:rPr>
+      </w:pPr>
+      <w:r>
+        <w:rPr>
+          <w:rStyle w:val="HTMLCode"/>
+          <w:color w:val="202124"/>
+        </w:rPr>
+        <w:t xml:space="preserve">      "summary": "Stamp duty paid is 5.0%; Karnataka ready-reckoner suggests 5.6% for this slab.",</w:t>
+      </w:r>
+    </w:p>
+    <w:p>
+      <w:pPr>
+        <w:pStyle w:val="HTMLPreformatted"/>
+        <w:rPr>
+          <w:rStyle w:val="HTMLCode"/>
+          <w:color w:val="202124"/>
+        </w:rPr>
+      </w:pPr>
+      <w:r>
+        <w:rPr>
+          <w:rStyle w:val="HTMLCode"/>
+          <w:color w:val="202124"/>
+        </w:rPr>
+        <w:t xml:space="preserve">      "recommendation": "Verify guidance value; pay differential before registration." }</w:t>
+      </w:r>
+    </w:p>
+    <w:p>
+      <w:pPr>
+        <w:pStyle w:val="HTMLPreformatted"/>
+        <w:rPr>
+          <w:rStyle w:val="HTMLCode"/>
+          <w:color w:val="202124"/>
+        </w:rPr>
+      </w:pPr>
+      <w:r>
+        <w:rPr>
+          <w:rStyle w:val="HTMLCode"/>
+          <w:color w:val="202124"/>
+        </w:rPr>
         <w:t xml:space="preserve">  ],</w:t>
       </w:r>
     </w:p>
@@ -5806,7 +6127,7 @@
           <w:rStyle w:val="HTMLCode"/>
           <w:color w:val="202124"/>
         </w:rPr>
-        <w:t xml:space="preserve">  "property": { "survey_numbers": ["43/2A"], "khata": "B-1234",</w:t>
+        <w:t xml:space="preserve">  "checklist": [</w:t>
       </w:r>
     </w:p>
     <w:p>
@@ -5822,7 +6143,7 @@
           <w:rStyle w:val="HTMLCode"/>
           <w:color w:val="202124"/>
         </w:rPr>
-        <w:t xml:space="preserve">                "area_sqft": 1200, "state": "Karnataka", "district": "Bengaluru-Urban" },</w:t>
+        <w:t xml:space="preserve">    "Get latest EC (last 30 days)",</w:t>
       </w:r>
     </w:p>
     <w:p>
@@ -5838,7 +6159,7 @@
           <w:rStyle w:val="HTMLCode"/>
           <w:color w:val="202124"/>
         </w:rPr>
-        <w:t xml:space="preserve">  "consideration": { "amount_inr": 8500000, "stamp_duty_inr": 425000 },</w:t>
+        <w:t xml:space="preserve">    "Verify khata transfer to buyer post-registration",</w:t>
       </w:r>
     </w:p>
     <w:p>
@@ -5854,446 +6175,74 @@
           <w:rStyle w:val="HTMLCode"/>
           <w:color w:val="202124"/>
         </w:rPr>
-        <w:t xml:space="preserve">  "chain_of_title": [ { "from": "K. Subbaiah", "to": "S. Ramesh", "year": 2015 } ]</w:t>
+        <w:t xml:space="preserve">    "Obtain name-variation affidavit"</w:t>
       </w:r>
     </w:p>
     <w:p>
       <w:pPr>
         <w:pStyle w:val="HTMLPreformatted"/>
         <w:rPr>
-          <w:color w:val="202124"/>
-        </w:rPr>
-      </w:pPr>
-      <w:r>
-        <w:rPr>
           <w:rStyle w:val="HTMLCode"/>
           <w:color w:val="202124"/>
         </w:rPr>
+      </w:pPr>
+      <w:r>
+        <w:rPr>
+          <w:rStyle w:val="HTMLCode"/>
+          <w:color w:val="202124"/>
+        </w:rPr>
+        <w:t xml:space="preserve">  ],</w:t>
+      </w:r>
+    </w:p>
+    <w:p>
+      <w:pPr>
+        <w:pStyle w:val="HTMLPreformatted"/>
+        <w:rPr>
+          <w:rStyle w:val="HTMLCode"/>
+          <w:color w:val="202124"/>
+        </w:rPr>
+      </w:pPr>
+      <w:r>
+        <w:rPr>
+          <w:rStyle w:val="HTMLCode"/>
+          <w:color w:val="202124"/>
+        </w:rPr>
+        <w:t xml:space="preserve">  "report_text": "…full lawyer-style summary…",</w:t>
+      </w:r>
+    </w:p>
+    <w:p>
+      <w:pPr>
+        <w:pStyle w:val="HTMLPreformatted"/>
+        <w:rPr>
+          <w:rStyle w:val="HTMLCode"/>
+          <w:color w:val="202124"/>
+        </w:rPr>
+      </w:pPr>
+      <w:r>
+        <w:rPr>
+          <w:rStyle w:val="HTMLCode"/>
+          <w:color w:val="202124"/>
+        </w:rPr>
+        <w:t xml:space="preserve">  "audit": { "bundle_id": "…", "agents_run": [...], "latency_ms": 71890 }</w:t>
+      </w:r>
+    </w:p>
+    <w:p>
+      <w:pPr>
+        <w:pStyle w:val="HTMLPreformatted"/>
+        <w:rPr>
+          <w:color w:val="202124"/>
+        </w:rPr>
+      </w:pPr>
+      <w:r>
+        <w:rPr>
+          <w:rStyle w:val="HTMLCode"/>
+          <w:color w:val="202124"/>
+        </w:rPr>
         <w:t>}</w:t>
       </w:r>
     </w:p>
     <w:p>
       <w:pPr>
-        <w:pStyle w:val="Heading3"/>
-        <w:rPr>
-          <w:rFonts w:eastAsia="Times New Roman"/>
-        </w:rPr>
-      </w:pPr>
-      <w:r>
-        <w:rPr>
-          <w:rFonts w:eastAsia="Times New Roman"/>
-        </w:rPr>
-        <w:t>Output</w:t>
-      </w:r>
-    </w:p>
-    <w:p>
-      <w:pPr>
-        <w:pStyle w:val="HTMLPreformatted"/>
-        <w:rPr>
-          <w:rStyle w:val="HTMLCode"/>
-          <w:color w:val="202124"/>
-        </w:rPr>
-      </w:pPr>
-      <w:r>
-        <w:rPr>
-          <w:rStyle w:val="HTMLCode"/>
-          <w:color w:val="202124"/>
-        </w:rPr>
-        <w:t>{</w:t>
-      </w:r>
-    </w:p>
-    <w:p>
-      <w:pPr>
-        <w:pStyle w:val="HTMLPreformatted"/>
-        <w:rPr>
-          <w:rStyle w:val="HTMLCode"/>
-          <w:color w:val="202124"/>
-        </w:rPr>
-      </w:pPr>
-      <w:r>
-        <w:rPr>
-          <w:rStyle w:val="HTMLCode"/>
-          <w:color w:val="202124"/>
-        </w:rPr>
-        <w:t xml:space="preserve">  "verdict": "clarify",</w:t>
-      </w:r>
-    </w:p>
-    <w:p>
-      <w:pPr>
-        <w:pStyle w:val="HTMLPreformatted"/>
-        <w:rPr>
-          <w:rStyle w:val="HTMLCode"/>
-          <w:color w:val="202124"/>
-        </w:rPr>
-      </w:pPr>
-      <w:r>
-        <w:rPr>
-          <w:rStyle w:val="HTMLCode"/>
-          <w:color w:val="202124"/>
-        </w:rPr>
-        <w:t xml:space="preserve">  "risk_score": 47,</w:t>
-      </w:r>
-    </w:p>
-    <w:p>
-      <w:pPr>
-        <w:pStyle w:val="HTMLPreformatted"/>
-        <w:rPr>
-          <w:rStyle w:val="HTMLCode"/>
-          <w:color w:val="202124"/>
-        </w:rPr>
-      </w:pPr>
-      <w:r>
-        <w:rPr>
-          <w:rStyle w:val="HTMLCode"/>
-          <w:color w:val="202124"/>
-        </w:rPr>
-        <w:t xml:space="preserve">  "severity_counts": { "low": 3, "medium": 4, "high": 2, "critical": 0 },</w:t>
-      </w:r>
-    </w:p>
-    <w:p>
-      <w:pPr>
-        <w:pStyle w:val="HTMLPreformatted"/>
-        <w:rPr>
-          <w:rStyle w:val="HTMLCode"/>
-          <w:color w:val="202124"/>
-        </w:rPr>
-      </w:pPr>
-      <w:r>
-        <w:rPr>
-          <w:rStyle w:val="HTMLCode"/>
-          <w:color w:val="202124"/>
-        </w:rPr>
-        <w:t xml:space="preserve">  "findings": [</w:t>
-      </w:r>
-    </w:p>
-    <w:p>
-      <w:pPr>
-        <w:pStyle w:val="HTMLPreformatted"/>
-        <w:rPr>
-          <w:rStyle w:val="HTMLCode"/>
-          <w:color w:val="202124"/>
-        </w:rPr>
-      </w:pPr>
-      <w:r>
-        <w:rPr>
-          <w:rStyle w:val="HTMLCode"/>
-          <w:color w:val="202124"/>
-        </w:rPr>
-        <w:t xml:space="preserve">    { "agent": "fraud",</w:t>
-      </w:r>
-    </w:p>
-    <w:p>
-      <w:pPr>
-        <w:pStyle w:val="HTMLPreformatted"/>
-        <w:rPr>
-          <w:rStyle w:val="HTMLCode"/>
-          <w:color w:val="202124"/>
-        </w:rPr>
-      </w:pPr>
-      <w:r>
-        <w:rPr>
-          <w:rStyle w:val="HTMLCode"/>
-          <w:color w:val="202124"/>
-        </w:rPr>
-        <w:t xml:space="preserve">      "fraud_type": "name_mismatch",</w:t>
-      </w:r>
-    </w:p>
-    <w:p>
-      <w:pPr>
-        <w:pStyle w:val="HTMLPreformatted"/>
-        <w:rPr>
-          <w:rStyle w:val="HTMLCode"/>
-          <w:color w:val="202124"/>
-        </w:rPr>
-      </w:pPr>
-      <w:r>
-        <w:rPr>
-          <w:rStyle w:val="HTMLCode"/>
-          <w:color w:val="202124"/>
-        </w:rPr>
-        <w:t xml:space="preserve">      "severity": "high",</w:t>
-      </w:r>
-    </w:p>
-    <w:p>
-      <w:pPr>
-        <w:pStyle w:val="HTMLPreformatted"/>
-        <w:rPr>
-          <w:rStyle w:val="HTMLCode"/>
-          <w:color w:val="202124"/>
-        </w:rPr>
-      </w:pPr>
-      <w:r>
-        <w:rPr>
-          <w:rStyle w:val="HTMLCode"/>
-          <w:color w:val="202124"/>
-        </w:rPr>
-        <w:t xml:space="preserve">      "summary": "</w:t>
-      </w:r>
-      <w:r>
-        <w:rPr>
-          <w:rStyle w:val="HTMLCode"/>
-          <w:color w:val="202124"/>
-        </w:rPr>
-        <w:t>Seller name on sale deed differs from EC (S. Ramesh vs Ramesh S.).",</w:t>
-      </w:r>
-    </w:p>
-    <w:p>
-      <w:pPr>
-        <w:pStyle w:val="HTMLPreformatted"/>
-        <w:rPr>
-          <w:rStyle w:val="HTMLCode"/>
-          <w:color w:val="202124"/>
-        </w:rPr>
-      </w:pPr>
-      <w:r>
-        <w:rPr>
-          <w:rStyle w:val="HTMLCode"/>
-          <w:color w:val="202124"/>
-        </w:rPr>
-        <w:t xml:space="preserve">      "evidence": ["sale_deed.pdf#p2", "ec.pdf#p1"],</w:t>
-      </w:r>
-    </w:p>
-    <w:p>
-      <w:pPr>
-        <w:pStyle w:val="HTMLPreformatted"/>
-        <w:rPr>
-          <w:rStyle w:val="HTMLCode"/>
-          <w:color w:val="202124"/>
-        </w:rPr>
-      </w:pPr>
-      <w:r>
-        <w:rPr>
-          <w:rStyle w:val="HTMLCode"/>
-          <w:color w:val="202124"/>
-        </w:rPr>
-        <w:t xml:space="preserve">      "recommendation": "Obtain affidavit of name variation from seller." },</w:t>
-      </w:r>
-    </w:p>
-    <w:p>
-      <w:pPr>
-        <w:pStyle w:val="HTMLPreformatted"/>
-        <w:rPr>
-          <w:rStyle w:val="HTMLCode"/>
-          <w:color w:val="202124"/>
-        </w:rPr>
-      </w:pPr>
-      <w:r>
-        <w:rPr>
-          <w:rStyle w:val="HTMLCode"/>
-          <w:color w:val="202124"/>
-        </w:rPr>
-        <w:t xml:space="preserve">    { "agent": "legal",</w:t>
-      </w:r>
-    </w:p>
-    <w:p>
-      <w:pPr>
-        <w:pStyle w:val="HTMLPreformatted"/>
-        <w:rPr>
-          <w:rStyle w:val="HTMLCode"/>
-          <w:color w:val="202124"/>
-        </w:rPr>
-      </w:pPr>
-      <w:r>
-        <w:rPr>
-          <w:rStyle w:val="HTMLCode"/>
-          <w:color w:val="202124"/>
-        </w:rPr>
-        <w:t xml:space="preserve">      "issue": "stamp_duty_short",</w:t>
-      </w:r>
-    </w:p>
-    <w:p>
-      <w:pPr>
-        <w:pStyle w:val="HTMLPreformatted"/>
-        <w:rPr>
-          <w:rStyle w:val="HTMLCode"/>
-          <w:color w:val="202124"/>
-        </w:rPr>
-      </w:pPr>
-      <w:r>
-        <w:rPr>
-          <w:rStyle w:val="HTMLCode"/>
-          <w:color w:val="202124"/>
-        </w:rPr>
-        <w:t xml:space="preserve">      "severity": "medium",</w:t>
-      </w:r>
-    </w:p>
-    <w:p>
-      <w:pPr>
-        <w:pStyle w:val="HTMLPreformatted"/>
-        <w:rPr>
-          <w:rStyle w:val="HTMLCode"/>
-          <w:color w:val="202124"/>
-        </w:rPr>
-      </w:pPr>
-      <w:r>
-        <w:rPr>
-          <w:rStyle w:val="HTMLCode"/>
-          <w:color w:val="202124"/>
-        </w:rPr>
-        <w:t xml:space="preserve">      "summary": "Stamp duty paid is 5.0%; Karnataka ready-reckoner suggests 5.6% for this slab.",</w:t>
-      </w:r>
-    </w:p>
-    <w:p>
-      <w:pPr>
-        <w:pStyle w:val="HTMLPreformatted"/>
-        <w:rPr>
-          <w:rStyle w:val="HTMLCode"/>
-          <w:color w:val="202124"/>
-        </w:rPr>
-      </w:pPr>
-      <w:r>
-        <w:rPr>
-          <w:rStyle w:val="HTMLCode"/>
-          <w:color w:val="202124"/>
-        </w:rPr>
-        <w:t xml:space="preserve">      "recommendation": "Verify guidance value; pay differential before registration." }</w:t>
-      </w:r>
-    </w:p>
-    <w:p>
-      <w:pPr>
-        <w:pStyle w:val="HTMLPreformatted"/>
-        <w:rPr>
-          <w:rStyle w:val="HTMLCode"/>
-          <w:color w:val="202124"/>
-        </w:rPr>
-      </w:pPr>
-      <w:r>
-        <w:rPr>
-          <w:rStyle w:val="HTMLCode"/>
-          <w:color w:val="202124"/>
-        </w:rPr>
-        <w:t xml:space="preserve">  ],</w:t>
-      </w:r>
-    </w:p>
-    <w:p>
-      <w:pPr>
-        <w:pStyle w:val="HTMLPreformatted"/>
-        <w:rPr>
-          <w:rStyle w:val="HTMLCode"/>
-          <w:color w:val="202124"/>
-        </w:rPr>
-      </w:pPr>
-      <w:r>
-        <w:rPr>
-          <w:rStyle w:val="HTMLCode"/>
-          <w:color w:val="202124"/>
-        </w:rPr>
-        <w:t xml:space="preserve">  "checklist": [</w:t>
-      </w:r>
-    </w:p>
-    <w:p>
-      <w:pPr>
-        <w:pStyle w:val="HTMLPreformatted"/>
-        <w:rPr>
-          <w:rStyle w:val="HTMLCode"/>
-          <w:color w:val="202124"/>
-        </w:rPr>
-      </w:pPr>
-      <w:r>
-        <w:rPr>
-          <w:rStyle w:val="HTMLCode"/>
-          <w:color w:val="202124"/>
-        </w:rPr>
-        <w:t xml:space="preserve">    "Get latest EC (last 30 days)",</w:t>
-      </w:r>
-    </w:p>
-    <w:p>
-      <w:pPr>
-        <w:pStyle w:val="HTMLPreformatted"/>
-        <w:rPr>
-          <w:rStyle w:val="HTMLCode"/>
-          <w:color w:val="202124"/>
-        </w:rPr>
-      </w:pPr>
-      <w:r>
-        <w:rPr>
-          <w:rStyle w:val="HTMLCode"/>
-          <w:color w:val="202124"/>
-        </w:rPr>
-        <w:t xml:space="preserve">    "Verify khata transfer to buyer post-registration",</w:t>
-      </w:r>
-    </w:p>
-    <w:p>
-      <w:pPr>
-        <w:pStyle w:val="HTMLPreformatted"/>
-        <w:rPr>
-          <w:rStyle w:val="HTMLCode"/>
-          <w:color w:val="202124"/>
-        </w:rPr>
-      </w:pPr>
-      <w:r>
-        <w:rPr>
-          <w:rStyle w:val="HTMLCode"/>
-          <w:color w:val="202124"/>
-        </w:rPr>
-        <w:t xml:space="preserve">    "Obtain name-variation affidavit"</w:t>
-      </w:r>
-    </w:p>
-    <w:p>
-      <w:pPr>
-        <w:pStyle w:val="HTMLPreformatted"/>
-        <w:rPr>
-          <w:rStyle w:val="HTMLCode"/>
-          <w:color w:val="202124"/>
-        </w:rPr>
-      </w:pPr>
-      <w:r>
-        <w:rPr>
-          <w:rStyle w:val="HTMLCode"/>
-          <w:color w:val="202124"/>
-        </w:rPr>
-        <w:t xml:space="preserve">  ],</w:t>
-      </w:r>
-    </w:p>
-    <w:p>
-      <w:pPr>
-        <w:pStyle w:val="HTMLPreformatted"/>
-        <w:rPr>
-          <w:rStyle w:val="HTMLCode"/>
-          <w:color w:val="202124"/>
-        </w:rPr>
-      </w:pPr>
-      <w:r>
-        <w:rPr>
-          <w:rStyle w:val="HTMLCode"/>
-          <w:color w:val="202124"/>
-        </w:rPr>
-        <w:t xml:space="preserve">  "report_text": "…full lawyer-style summary…",</w:t>
-      </w:r>
-    </w:p>
-    <w:p>
-      <w:pPr>
-        <w:pStyle w:val="HTMLPreformatted"/>
-        <w:rPr>
-          <w:rStyle w:val="HTMLCode"/>
-          <w:color w:val="202124"/>
-        </w:rPr>
-      </w:pPr>
-      <w:r>
-        <w:rPr>
-          <w:rStyle w:val="HTMLCode"/>
-          <w:color w:val="202124"/>
-        </w:rPr>
-        <w:t xml:space="preserve">  "audit": { "bundle_id": "…", "agents_run": [...], "latency_ms": 71890 }</w:t>
-      </w:r>
-    </w:p>
-    <w:p>
-      <w:pPr>
-        <w:pStyle w:val="HTMLPreformatted"/>
-        <w:rPr>
-          <w:color w:val="202124"/>
-        </w:rPr>
-      </w:pPr>
-      <w:r>
-        <w:rPr>
-          <w:rStyle w:val="HTMLCode"/>
-          <w:color w:val="202124"/>
-        </w:rPr>
-        <w:t>}</w:t>
-      </w:r>
-    </w:p>
-    <w:p>
-      <w:pPr>
         <w:pStyle w:val="NormalWeb"/>
         <w:rPr>
           <w:rFonts w:ascii="Calibri" w:hAnsi="Calibri" w:cs="Calibri"/>
@@ -6330,7 +6279,7 @@
           <w:szCs w:val="22"/>
         </w:rPr>
         <w:pict w14:anchorId="51A6E80E">
-          <v:rect id="_x0000_i1035" style="width:0;height:1.5pt" o:hralign="center" o:hrstd="t" o:hr="t" fillcolor="#a0a0a0" stroked="f"/>
+          <v:rect id="_x0000_i1033" style="width:0;height:1.5pt" o:hralign="center" o:hrstd="t" o:hr="t" fillcolor="#a0a0a0" stroked="f"/>
         </w:pict>
       </w:r>
     </w:p>
@@ -6385,7 +6334,6 @@
           <w:sz w:val="22"/>
           <w:szCs w:val="22"/>
         </w:rPr>
-        <w:lastRenderedPageBreak/>
         <w:t>Strict JSON schema</w:t>
       </w:r>
       <w:r>
@@ -6551,16 +6499,7 @@
           <w:sz w:val="22"/>
           <w:szCs w:val="22"/>
         </w:rPr>
-        <w:t xml:space="preserve"> </w:t>
-      </w:r>
-      <w:r>
-        <w:rPr>
-          <w:rFonts w:ascii="Calibri" w:eastAsia="Times New Roman" w:hAnsi="Calibri" w:cs="Calibri"/>
-          <w:color w:val="202124"/>
-          <w:sz w:val="22"/>
-          <w:szCs w:val="22"/>
-        </w:rPr>
-        <w:t>— rule packs per state prevent over-flagging (e.g., agricultural restrictions don't fire on urban deeds).</w:t>
+        <w:t xml:space="preserve"> — rule packs per state prevent over-flagging (e.g., agricultural restrictions don't fire on urban deeds).</w:t>
       </w:r>
     </w:p>
     <w:p>
@@ -6707,6 +6646,7 @@
           <w:sz w:val="22"/>
           <w:szCs w:val="22"/>
         </w:rPr>
+        <w:lastRenderedPageBreak/>
         <w:t>Human-in-the-loop hooks</w:t>
       </w:r>
       <w:r>
@@ -7415,7 +7355,6 @@
           <w:sz w:val="22"/>
           <w:szCs w:val="22"/>
         </w:rPr>
-        <w:lastRenderedPageBreak/>
         <w:t>Availability: 99.5 % monthly.</w:t>
       </w:r>
     </w:p>
@@ -7487,7 +7426,7 @@
           <w:szCs w:val="22"/>
         </w:rPr>
         <w:pict w14:anchorId="0B21421F">
-          <v:rect id="_x0000_i1036" style="width:0;height:1.5pt" o:hralign="center" o:hrstd="t" o:hr="t" fillcolor="#a0a0a0" stroked="f"/>
+          <v:rect id="_x0000_i1034" style="width:0;height:1.5pt" o:hralign="center" o:hrstd="t" o:hr="t" fillcolor="#a0a0a0" stroked="f"/>
         </w:pict>
       </w:r>
     </w:p>
@@ -9857,7 +9796,6 @@
   <w:style w:type="character" w:default="1" w:styleId="DefaultParagraphFont">
     <w:name w:val="Default Paragraph Font"/>
     <w:uiPriority w:val="1"/>
-    <w:semiHidden/>
     <w:unhideWhenUsed/>
   </w:style>
   <w:style w:type="table" w:default="1" w:styleId="TableNormal">

</xml_diff>